<commit_message>
chore -- NI1: not sure what is going on
</commit_message>
<xml_diff>
--- a/42NI Nejroiformatyka/1/NI_KNT-122_Onyshchenko_19_PR1.docx
+++ b/42NI Nejroiformatyka/1/NI_KNT-122_Onyshchenko_19_PR1.docx
@@ -320,15 +320,7 @@
         <w:tab/>
         <w:tab/>
         <w:tab/>
-        <w:t xml:space="preserve">Афанасьєва </w:t>
-      </w:r>
-      <w:r>
-        <w:rPr/>
-        <w:t>А.В</w:t>
-      </w:r>
-      <w:r>
-        <w:rPr/>
-        <w:t>.</w:t>
+        <w:t>Афанасьєва А.В.</w:t>
       </w:r>
     </w:p>
     <w:p>
@@ -442,17 +434,7 @@
           <w:smallCaps w:val="false"/>
           <w:spacing w:val="0"/>
         </w:rPr>
-        <w:t>В</w:t>
-      </w:r>
-      <w:r>
-        <w:rPr>
-          <w:b w:val="false"/>
-          <w:i w:val="false"/>
-          <w:caps w:val="false"/>
-          <w:smallCaps w:val="false"/>
-          <w:spacing w:val="0"/>
-        </w:rPr>
-        <w:t>ивчити архітектури формального нейрона, багатошарового персептрона і радіально-базисної мережі, а також методи їхнього навчання; ознайомитися з програмними продуктами, що моделюють персептрони та радіально-базисні мережі</w:t>
+        <w:t>Вивчити архітектури формального нейрона, багатошарового персептрона і радіально-базисної мережі, а також методи їхнього навчання; ознайомитися з програмними продуктами, що моделюють персептрони та радіально-базисні мережі</w:t>
       </w:r>
       <w:r>
         <w:rPr/>
@@ -508,7 +490,161 @@
         <w:rPr>
           <w:lang w:val="en-US"/>
         </w:rPr>
-        <w:t xml:space="preserve">1. </w:t>
+        <w:t>1. Ознайомитися з конспектом лекцій та рекомендованою літературою.</w:t>
+      </w:r>
+    </w:p>
+    <w:p>
+      <w:pPr>
+        <w:pStyle w:val="p11"/>
+        <w:rPr>
+          <w:lang w:val="en-US"/>
+        </w:rPr>
+      </w:pPr>
+      <w:r>
+        <w:rPr>
+          <w:lang w:val="en-US"/>
+        </w:rPr>
+        <w:t>2. Вивчити архітектури формального нейрона, багатошарового персептрона та радіально-базисної мережі, а також методи їхнього навчання.</w:t>
+      </w:r>
+    </w:p>
+    <w:p>
+      <w:pPr>
+        <w:pStyle w:val="p11"/>
+        <w:rPr>
+          <w:lang w:val="en-US"/>
+        </w:rPr>
+      </w:pPr>
+      <w:r>
+        <w:rPr>
+          <w:lang w:val="en-US"/>
+        </w:rPr>
+        <w:t>3. Використовуючи документацію рекомендованого викладачем програмного засобу, вивчити його архітектуру і компоненти, призначені для моделювання і навчання нейромереж прямого поширення, введення і виведення даних, підготовки звітів (виведення і відображення результатів роботи).</w:t>
+      </w:r>
+    </w:p>
+    <w:p>
+      <w:pPr>
+        <w:pStyle w:val="p11"/>
+        <w:rPr>
+          <w:lang w:val="en-US"/>
+        </w:rPr>
+      </w:pPr>
+      <w:r>
+        <w:rPr>
+          <w:lang w:val="en-US"/>
+        </w:rPr>
+        <w:t>4. Визначити за табл. 1.1 згідно з номером варіанта студента (обирається за журналом) номер підрозділу Додатку В, що містить опис прикладної задачі, та номери контрольних питань, відповіді на які належить навести у звіті. Визначити за табл. 1.2 кількості шарів та нейронів у шарах для побудови багатошарових персептронів, а також функцію активації для завдання 6.</w:t>
+      </w:r>
+    </w:p>
+    <w:p>
+      <w:pPr>
+        <w:pStyle w:val="p11"/>
+        <w:rPr>
+          <w:lang w:val="en-US"/>
+        </w:rPr>
+      </w:pPr>
+      <w:r>
+        <w:rPr>
+          <w:lang w:val="en-US"/>
+        </w:rPr>
+        <w:t>5. Використовуючи Python для відповідних варіанту студента вхідних даних вирішити прикладну задачу на основі одношарового та багатошарового персептронів, використовуючи різні методи навчання та різні функції активації. Вирішити ту саму задачу на основі радіально-базисної мережі.</w:t>
+      </w:r>
+    </w:p>
+    <w:p>
+      <w:pPr>
+        <w:pStyle w:val="p11"/>
+        <w:rPr>
+          <w:lang w:val="en-US"/>
+        </w:rPr>
+      </w:pPr>
+      <w:r>
+        <w:rPr>
+          <w:lang w:val="en-US"/>
+        </w:rPr>
+        <w:t>6. Змінюючи значення кроку навчання, для одношарового та багатошарового персептронів з заданою функцією активації, що відповідає номеру варіанту студента (див. табл. 1.2) дослідити, як впливає величина кроку навчання на час навчання. Побудувати графіки залежності часу навчання персептронів від величини кроку навчання.</w:t>
+      </w:r>
+    </w:p>
+    <w:p>
+      <w:pPr>
+        <w:pStyle w:val="p11"/>
+        <w:rPr>
+          <w:lang w:val="en-US"/>
+        </w:rPr>
+      </w:pPr>
+      <w:r>
+        <w:rPr>
+          <w:lang w:val="en-US"/>
+        </w:rPr>
+        <w:t>7. Зберегти у файлі на диску початкові параметри нейромоделей, результати їхнього навчання (матрицю ваг та структуру з зазначенням функцій активації і кількості нейроелементів у шарах) та роботи для навчальної та контрольної вибірок (помилку класифікації (оцінювання), значення на входах і виході, час навчання, час класифікації).</w:t>
+      </w:r>
+    </w:p>
+    <w:p>
+      <w:pPr>
+        <w:pStyle w:val="p11"/>
+        <w:rPr>
+          <w:lang w:val="en-US"/>
+        </w:rPr>
+      </w:pPr>
+      <w:r>
+        <w:rPr>
+          <w:lang w:val="en-US"/>
+        </w:rPr>
+        <w:t>8. Результати виконання пп. 5-7 занести в таблицю, стовпці якої повинні мати назви: назва архітектури нейромережі, кількість шарів, кількість нейронів у шарах, функції активації нейронів у шарах, метод навчання, час навчання, час класифікації (оцінювання) навченої мережі для навчальної вибірки, помилка класифікації (оцінювання) для навчальної вибірки, час класифікації (оцінювання) навченої мережі для тестової вибірки, помилка класифікації (оцінювання) для тестової вибірки.</w:t>
+      </w:r>
+    </w:p>
+    <w:p>
+      <w:pPr>
+        <w:pStyle w:val="p11"/>
+        <w:rPr>
+          <w:lang w:val="en-US"/>
+        </w:rPr>
+      </w:pPr>
+      <w:r>
+        <w:rPr>
+          <w:lang w:val="en-US"/>
+        </w:rPr>
+        <w:t>9. Проаналізувати отримані результати і зробити висновки про те, як впливає вид функції активації формального нейрона на час навчання і час класифікації (оцінювання), а також величину помилки навчання і класифікації (оцінювання) одношарового персептрона; як впливають вид функції активації і вид коригувального правила ваг (метод навчання) на час навчання і класифікації (оцінювання), а також величину помилки навчання та класифікації багатошарового персептрона; яка модель нейромереж прямого поширення краще підходить для вирішення задачі, що відповідає варіанту.</w:t>
+      </w:r>
+    </w:p>
+    <w:p>
+      <w:pPr>
+        <w:pStyle w:val="p11"/>
+        <w:rPr>
+          <w:lang w:val="en-US"/>
+        </w:rPr>
+      </w:pPr>
+      <w:r>
+        <w:rPr>
+          <w:lang w:val="en-US"/>
+        </w:rPr>
+        <w:t>10. Порівняти одношаровий та багатошаровий персептрони, радіально-базисну мережу та багатошаровий персептрон за швидкістю навчання і точністю класифікації; принципами побудови архітектури.</w:t>
+      </w:r>
+    </w:p>
+    <w:p>
+      <w:pPr>
+        <w:pStyle w:val="p11"/>
+        <w:rPr>
+          <w:lang w:val="en-US"/>
+        </w:rPr>
+      </w:pPr>
+      <w:r>
+        <w:rPr>
+          <w:lang w:val="en-US"/>
+        </w:rPr>
+        <w:t>11. Відповісти на контрольні питання.</w:t>
+      </w:r>
+    </w:p>
+    <w:p>
+      <w:pPr>
+        <w:pStyle w:val="p11"/>
+        <w:rPr>
+          <w:lang w:val="en-US"/>
+        </w:rPr>
+      </w:pPr>
+      <w:r>
+        <w:rPr>
+          <w:lang w:val="en-US"/>
+        </w:rPr>
+        <w:t>12. Оформити звіт з роботи.</w:t>
       </w:r>
     </w:p>
     <w:p>
@@ -542,11 +678,32 @@
     </w:p>
     <w:p>
       <w:pPr>
-        <w:pStyle w:val="p11"/>
-        <w:rPr/>
-      </w:pPr>
-      <w:r>
-        <w:rPr/>
+        <w:pStyle w:val="H2"/>
+        <w:rPr/>
+      </w:pPr>
+      <w:r>
+        <w:rPr/>
+        <w:t>Поняття: нейрон, нейромережа, нейрокомп’ютер, нейроінформатика.</w:t>
+      </w:r>
+    </w:p>
+    <w:p>
+      <w:pPr>
+        <w:pStyle w:val="H2"/>
+        <w:rPr/>
+      </w:pPr>
+      <w:r>
+        <w:rPr/>
+        <w:t>Класифікація та види моделей нейромереж.</w:t>
+      </w:r>
+    </w:p>
+    <w:p>
+      <w:pPr>
+        <w:pStyle w:val="H2"/>
+        <w:rPr/>
+      </w:pPr>
+      <w:r>
+        <w:rPr/>
+        <w:t>Властивості штучних нейромереж.</w:t>
       </w:r>
     </w:p>
     <w:sectPr>
@@ -1347,12 +1504,12 @@
       <w:lang w:val="en-US" w:eastAsia="uk-UA"/>
     </w:rPr>
   </w:style>
-  <w:style w:type="character" w:styleId="Style12">
-    <w:name w:val="Символ нумерації"/>
+  <w:style w:type="character" w:styleId="user">
+    <w:name w:val="Символ нумерації (user)"/>
     <w:qFormat/>
     <w:rPr/>
   </w:style>
-  <w:style w:type="paragraph" w:styleId="Style13">
+  <w:style w:type="paragraph" w:styleId="Style12">
     <w:name w:val="Заголовок"/>
     <w:basedOn w:val="Normal"/>
     <w:next w:val="BodyText"/>
@@ -1362,7 +1519,7 @@
       <w:spacing w:before="240" w:after="120"/>
     </w:pPr>
     <w:rPr>
-      <w:rFonts w:ascii="Liberation Sans" w:hAnsi="Liberation Sans" w:eastAsia="Microsoft YaHei" w:cs="Lucida Sans"/>
+      <w:rFonts w:ascii="Liberation Sans" w:hAnsi="Liberation Sans" w:eastAsia="Microsoft YaHei" w:cs="Arial Unicode MS"/>
       <w:sz w:val="28"/>
       <w:szCs w:val="28"/>
     </w:rPr>
@@ -1399,7 +1556,7 @@
       <w:szCs w:val="24"/>
     </w:rPr>
   </w:style>
-  <w:style w:type="paragraph" w:styleId="Style14">
+  <w:style w:type="paragraph" w:styleId="Style13">
     <w:name w:val="Покажчик"/>
     <w:basedOn w:val="Normal"/>
     <w:qFormat/>
@@ -1407,10 +1564,10 @@
       <w:suppressLineNumbers/>
     </w:pPr>
     <w:rPr>
-      <w:rFonts w:cs="Lucida Sans"/>
-    </w:rPr>
-  </w:style>
-  <w:style w:type="paragraph" w:styleId="user">
+      <w:rFonts w:cs="Arial Unicode MS"/>
+    </w:rPr>
+  </w:style>
+  <w:style w:type="paragraph" w:styleId="user1">
     <w:name w:val="Заголовок (user)"/>
     <w:basedOn w:val="Normal"/>
     <w:next w:val="BodyText"/>
@@ -1420,12 +1577,12 @@
       <w:spacing w:before="240" w:after="120"/>
     </w:pPr>
     <w:rPr>
-      <w:rFonts w:ascii="Liberation Sans" w:hAnsi="Liberation Sans" w:eastAsia="Microsoft YaHei" w:cs="Arial Unicode MS"/>
+      <w:rFonts w:ascii="Liberation Sans" w:hAnsi="Liberation Sans" w:eastAsia="Microsoft YaHei" w:cs="Lucida Sans"/>
       <w:sz w:val="28"/>
       <w:szCs w:val="28"/>
     </w:rPr>
   </w:style>
-  <w:style w:type="paragraph" w:styleId="user1">
+  <w:style w:type="paragraph" w:styleId="user2">
     <w:name w:val="Покажчик (user)"/>
     <w:basedOn w:val="Normal"/>
     <w:qFormat/>
@@ -1433,12 +1590,12 @@
       <w:suppressLineNumbers/>
     </w:pPr>
     <w:rPr>
-      <w:rFonts w:cs="Arial Unicode MS"/>
+      <w:rFonts w:cs="Lucida Sans"/>
     </w:rPr>
   </w:style>
   <w:style w:type="paragraph" w:styleId="IndexHeading">
     <w:name w:val="index heading"/>
-    <w:basedOn w:val="user"/>
+    <w:basedOn w:val="Style12"/>
     <w:pPr/>
     <w:rPr/>
   </w:style>
@@ -1516,7 +1673,9 @@
     <w:link w:val="H2Char"/>
     <w:qFormat/>
     <w:rsid w:val="00062cf8"/>
-    <w:pPr/>
+    <w:pPr>
+      <w:spacing w:lineRule="auto" w:line="360" w:before="0" w:after="0"/>
+    </w:pPr>
     <w:rPr>
       <w:rFonts w:ascii="Times New Roman" w:hAnsi="Times New Roman" w:cs="Times New Roman"/>
       <w:b/>
@@ -1711,8 +1870,8 @@
     </w:pPr>
     <w:rPr/>
   </w:style>
-  <w:style w:type="numbering" w:styleId="user2" w:default="1">
-    <w:name w:val="Без маркерів (user)"/>
+  <w:style w:type="numbering" w:styleId="Style14" w:default="1">
+    <w:name w:val="Без маркерів"/>
     <w:uiPriority w:val="99"/>
     <w:semiHidden/>
     <w:unhideWhenUsed/>

</xml_diff>

<commit_message>
docs -- NI: add an individual task
</commit_message>
<xml_diff>
--- a/42NI Nejroiformatyka/1/NI_KNT-122_Onyshchenko_19_PR1.docx
+++ b/42NI Nejroiformatyka/1/NI_KNT-122_Onyshchenko_19_PR1.docx
@@ -574,7 +574,333 @@
         <w:rPr>
           <w:lang w:val="en-US"/>
         </w:rPr>
-        <w:t>Кількість шарів: 2, кількість нейронів у шарах: 8-1, назва функції активації: логістична, сигмоїдна.</w:t>
+      </w:r>
+    </w:p>
+    <w:p>
+      <w:pPr>
+        <w:pStyle w:val="H2"/>
+        <w:rPr/>
+      </w:pPr>
+      <w:r>
+        <w:rPr/>
+        <w:t>Б.2 Прогнозування надійності виробів електронної техніки</w:t>
+      </w:r>
+    </w:p>
+    <w:p>
+      <w:pPr>
+        <w:pStyle w:val="P1"/>
+        <w:rPr/>
+      </w:pPr>
+      <w:r>
+        <w:rPr/>
+      </w:r>
+    </w:p>
+    <w:p>
+      <w:pPr>
+        <w:pStyle w:val="Normal"/>
+        <w:rPr>
+          <w:lang w:val="en-US"/>
+        </w:rPr>
+      </w:pPr>
+      <w:r>
+        <w:rPr>
+          <w:lang w:val="en-US"/>
+        </w:rPr>
+        <w:t>Вироби електронної техніки (ОСТ 11 ОДО.052.005), далі ВЕТ, являють собою ненадійні вироби, що можуть бути охарактеризовані наступними параметрами:</w:t>
+      </w:r>
+    </w:p>
+    <w:p>
+      <w:pPr>
+        <w:pStyle w:val="Normal"/>
+        <w:rPr>
+          <w:lang w:val="en-US"/>
+        </w:rPr>
+      </w:pPr>
+      <w:r>
+        <w:rPr>
+          <w:lang w:val="en-US"/>
+        </w:rPr>
+        <w:t>х1 – струм сітки першої зворотний, мкА;</w:t>
+      </w:r>
+    </w:p>
+    <w:p>
+      <w:pPr>
+        <w:pStyle w:val="Normal"/>
+        <w:rPr>
+          <w:lang w:val="en-US"/>
+        </w:rPr>
+      </w:pPr>
+      <w:r>
+        <w:rPr>
+          <w:lang w:val="en-US"/>
+        </w:rPr>
+        <w:t>х2 – струм сітки першої зворотний при перегарті, мкА;</w:t>
+      </w:r>
+    </w:p>
+    <w:p>
+      <w:pPr>
+        <w:pStyle w:val="Normal"/>
+        <w:rPr>
+          <w:lang w:val="en-US"/>
+        </w:rPr>
+      </w:pPr>
+      <w:r>
+        <w:rPr>
+          <w:lang w:val="en-US"/>
+        </w:rPr>
+        <w:t>х3 – струм анода, мА;</w:t>
+      </w:r>
+    </w:p>
+    <w:p>
+      <w:pPr>
+        <w:pStyle w:val="Normal"/>
+        <w:rPr>
+          <w:lang w:val="en-US"/>
+        </w:rPr>
+      </w:pPr>
+      <w:r>
+        <w:rPr>
+          <w:lang w:val="en-US"/>
+        </w:rPr>
+        <w:t>х4 – струм сітки другий, мА;</w:t>
+      </w:r>
+    </w:p>
+    <w:p>
+      <w:pPr>
+        <w:pStyle w:val="Normal"/>
+        <w:rPr>
+          <w:lang w:val="en-US"/>
+        </w:rPr>
+      </w:pPr>
+      <w:r>
+        <w:rPr>
+          <w:lang w:val="en-US"/>
+        </w:rPr>
+        <w:t>х5 – крутість характеристики, мА/В;</w:t>
+      </w:r>
+    </w:p>
+    <w:p>
+      <w:pPr>
+        <w:pStyle w:val="Normal"/>
+        <w:rPr>
+          <w:lang w:val="en-US"/>
+        </w:rPr>
+      </w:pPr>
+      <w:r>
+        <w:rPr>
+          <w:lang w:val="en-US"/>
+        </w:rPr>
+        <w:t>х6 – крутість характеристики при недожару, мА/В;</w:t>
+      </w:r>
+    </w:p>
+    <w:p>
+      <w:pPr>
+        <w:pStyle w:val="Normal"/>
+        <w:rPr>
+          <w:lang w:val="en-US"/>
+        </w:rPr>
+      </w:pPr>
+      <w:r>
+        <w:rPr>
+          <w:lang w:val="en-US"/>
+        </w:rPr>
+        <w:t>х7 – струм розжарення, мА;</w:t>
+      </w:r>
+    </w:p>
+    <w:p>
+      <w:pPr>
+        <w:pStyle w:val="Normal"/>
+        <w:rPr>
+          <w:lang w:val="en-US"/>
+        </w:rPr>
+      </w:pPr>
+      <w:r>
+        <w:rPr>
+          <w:lang w:val="en-US"/>
+        </w:rPr>
+        <w:t>х8 – ємність вхідна, пф;</w:t>
+      </w:r>
+    </w:p>
+    <w:p>
+      <w:pPr>
+        <w:pStyle w:val="Normal"/>
+        <w:rPr>
+          <w:lang w:val="en-US"/>
+        </w:rPr>
+      </w:pPr>
+      <w:r>
+        <w:rPr>
+          <w:lang w:val="en-US"/>
+        </w:rPr>
+        <w:t>х9 – ємність вихідна, пф;</w:t>
+      </w:r>
+    </w:p>
+    <w:p>
+      <w:pPr>
+        <w:pStyle w:val="Normal"/>
+        <w:rPr>
+          <w:lang w:val="en-US"/>
+        </w:rPr>
+      </w:pPr>
+      <w:r>
+        <w:rPr>
+          <w:lang w:val="en-US"/>
+        </w:rPr>
+        <w:t>х10 – ємність прохідна, пф;</w:t>
+      </w:r>
+    </w:p>
+    <w:p>
+      <w:pPr>
+        <w:pStyle w:val="Normal"/>
+        <w:rPr>
+          <w:lang w:val="en-US"/>
+        </w:rPr>
+      </w:pPr>
+      <w:r>
+        <w:rPr>
+          <w:lang w:val="en-US"/>
+        </w:rPr>
+        <w:t>х11 – час готовності, с;</w:t>
+      </w:r>
+    </w:p>
+    <w:p>
+      <w:pPr>
+        <w:pStyle w:val="Normal"/>
+        <w:rPr>
+          <w:lang w:val="en-US"/>
+        </w:rPr>
+      </w:pPr>
+      <w:r>
+        <w:rPr>
+          <w:lang w:val="en-US"/>
+        </w:rPr>
+        <w:t>х12 – коефіцієнт підсилення в тріодному включенні;</w:t>
+      </w:r>
+    </w:p>
+    <w:p>
+      <w:pPr>
+        <w:pStyle w:val="Normal"/>
+        <w:rPr>
+          <w:lang w:val="en-US"/>
+        </w:rPr>
+      </w:pPr>
+      <w:r>
+        <w:rPr>
+          <w:lang w:val="en-US"/>
+        </w:rPr>
+        <w:t>х13 – напруга контактної різниці потенціалів, В;</w:t>
+      </w:r>
+    </w:p>
+    <w:p>
+      <w:pPr>
+        <w:pStyle w:val="Normal"/>
+        <w:rPr>
+          <w:lang w:val="en-US"/>
+        </w:rPr>
+      </w:pPr>
+      <w:r>
+        <w:rPr>
+          <w:lang w:val="en-US"/>
+        </w:rPr>
+        <w:t>х14 – відносна зміна струму анода, %;</w:t>
+      </w:r>
+    </w:p>
+    <w:p>
+      <w:pPr>
+        <w:pStyle w:val="Normal"/>
+        <w:rPr>
+          <w:lang w:val="en-US"/>
+        </w:rPr>
+      </w:pPr>
+      <w:r>
+        <w:rPr>
+          <w:lang w:val="en-US"/>
+        </w:rPr>
+        <w:t>х15 – струм емісії при недожару, А;</w:t>
+      </w:r>
+    </w:p>
+    <w:p>
+      <w:pPr>
+        <w:pStyle w:val="Normal"/>
+        <w:rPr>
+          <w:lang w:val="en-US"/>
+        </w:rPr>
+      </w:pPr>
+      <w:r>
+        <w:rPr>
+          <w:lang w:val="en-US"/>
+        </w:rPr>
+        <w:t>х16 – опір оксидного шару, Ом;</w:t>
+      </w:r>
+    </w:p>
+    <w:p>
+      <w:pPr>
+        <w:pStyle w:val="Normal"/>
+        <w:rPr>
+          <w:lang w:val="en-US"/>
+        </w:rPr>
+      </w:pPr>
+      <w:r>
+        <w:rPr>
+          <w:lang w:val="en-US"/>
+        </w:rPr>
+        <w:t>х17 – струм емісії, А;</w:t>
+      </w:r>
+    </w:p>
+    <w:p>
+      <w:pPr>
+        <w:pStyle w:val="Normal"/>
+        <w:rPr>
+          <w:lang w:val="en-US"/>
+        </w:rPr>
+      </w:pPr>
+      <w:r>
+        <w:rPr>
+          <w:lang w:val="en-US"/>
+        </w:rPr>
+        <w:t>х18 – відносна зміна крутості характеристики після іспитів на довговічність 5000 год., %.</w:t>
+      </w:r>
+    </w:p>
+    <w:p>
+      <w:pPr>
+        <w:pStyle w:val="Normal"/>
+        <w:rPr>
+          <w:lang w:val="en-US"/>
+        </w:rPr>
+      </w:pPr>
+      <w:r>
+        <w:rPr>
+          <w:lang w:val="en-US"/>
+        </w:rPr>
+        <w:t>Будучи піддані навантаженню в процесі експлуатації ці вироби можуть виходити з ладу в різний час. Задачею контролю якості цих виробів при завершенні виробництва, а також в експлуатації є прогнозування ресурсу (терміну служби) ВЕТ. Причому на практиці цілком достатньо якісного прогнозу, тобто досить спрогнозувати, чи зможе конкретний виріб прослужити заданий термін чи ні. Для побудови моделі якісної залежності між параметрами і класом ВЕТ можна використовувати експериментально отримані і пронормовані дані.</w:t>
+      </w:r>
+    </w:p>
+    <w:p>
+      <w:pPr>
+        <w:pStyle w:val="Normal"/>
+        <w:rPr>
+          <w:lang w:val="en-US"/>
+        </w:rPr>
+      </w:pPr>
+      <w:r>
+        <w:rPr>
+          <w:lang w:val="en-US"/>
+        </w:rPr>
+        <w:t>Формалізувавши задачу маємо: 18 вхідних ознак, що містять параметри ВЕТ 1 цільову ознаку - номер класу ВЕТ (1 - дефектний, 0 - гідний).</w:t>
+      </w:r>
+    </w:p>
+    <w:p>
+      <w:pPr>
+        <w:pStyle w:val="Normal"/>
+        <w:rPr>
+          <w:lang w:val="en-US"/>
+        </w:rPr>
+      </w:pPr>
+      <w:r>
+        <w:rPr>
+          <w:lang w:val="en-US"/>
+        </w:rPr>
+        <w:t>Кількість шарів: 2, кількість нейронів у шарах: 8-1, назва функції активації: логістична сигмоїдна.</w:t>
       </w:r>
     </w:p>
     <w:p>

</xml_diff>

<commit_message>
docs: one control question done :(
</commit_message>
<xml_diff>
--- a/42NI Nejroiformatyka/1/NI_KNT-122_Onyshchenko_19_PR1.docx
+++ b/42NI Nejroiformatyka/1/NI_KNT-122_Onyshchenko_19_PR1.docx
@@ -1037,11 +1037,35 @@
       </w:pPr>
       <w:r>
         <w:rPr/>
-        <w:t xml:space="preserve">3 </w:t>
-      </w:r>
-      <w:r>
-        <w:rPr/>
-        <w:t>Властивості штучних нейромереж.</w:t>
+        <w:t>3 Властивості штучних нейромереж.</w:t>
+      </w:r>
+    </w:p>
+    <w:p>
+      <w:pPr>
+        <w:pStyle w:val="P1"/>
+        <w:rPr/>
+      </w:pPr>
+      <w:r>
+        <w:rPr/>
+      </w:r>
+    </w:p>
+    <w:p>
+      <w:pPr>
+        <w:pStyle w:val="P1"/>
+        <w:rPr/>
+      </w:pPr>
+      <w:r>
+        <w:rPr/>
+        <w:t>Бувають одношарові або багатошарові. Складаються з нейронів. Нейрони складаються з дендритів (вхідних зв’язків) та аксона (вихідного зв’язку).</w:t>
+      </w:r>
+    </w:p>
+    <w:p>
+      <w:pPr>
+        <w:pStyle w:val="P1"/>
+        <w:rPr/>
+      </w:pPr>
+      <w:r>
+        <w:rPr/>
       </w:r>
     </w:p>
     <w:p>
@@ -1882,12 +1906,12 @@
       <w:lang w:val="en-US" w:eastAsia="uk-UA"/>
     </w:rPr>
   </w:style>
-  <w:style w:type="character" w:styleId="Style12">
-    <w:name w:val="Символ нумерації"/>
+  <w:style w:type="character" w:styleId="user">
+    <w:name w:val="Символ нумерації (user)"/>
     <w:qFormat/>
     <w:rPr/>
   </w:style>
-  <w:style w:type="paragraph" w:styleId="Style13">
+  <w:style w:type="paragraph" w:styleId="Style12">
     <w:name w:val="Заголовок"/>
     <w:basedOn w:val="Normal"/>
     <w:next w:val="BodyText"/>
@@ -1897,7 +1921,7 @@
       <w:spacing w:before="240" w:after="120"/>
     </w:pPr>
     <w:rPr>
-      <w:rFonts w:ascii="Liberation Sans" w:hAnsi="Liberation Sans" w:eastAsia="Microsoft YaHei" w:cs="Lucida Sans"/>
+      <w:rFonts w:ascii="Liberation Sans" w:hAnsi="Liberation Sans" w:eastAsia="Microsoft YaHei" w:cs="Arial Unicode MS"/>
       <w:sz w:val="28"/>
       <w:szCs w:val="28"/>
     </w:rPr>
@@ -1934,7 +1958,7 @@
       <w:szCs w:val="24"/>
     </w:rPr>
   </w:style>
-  <w:style w:type="paragraph" w:styleId="Style14">
+  <w:style w:type="paragraph" w:styleId="Style13">
     <w:name w:val="Покажчик"/>
     <w:basedOn w:val="Normal"/>
     <w:qFormat/>
@@ -1942,10 +1966,10 @@
       <w:suppressLineNumbers/>
     </w:pPr>
     <w:rPr>
-      <w:rFonts w:cs="Lucida Sans"/>
-    </w:rPr>
-  </w:style>
-  <w:style w:type="paragraph" w:styleId="user">
+      <w:rFonts w:cs="Arial Unicode MS"/>
+    </w:rPr>
+  </w:style>
+  <w:style w:type="paragraph" w:styleId="user1">
     <w:name w:val="Заголовок (user)"/>
     <w:basedOn w:val="Normal"/>
     <w:next w:val="BodyText"/>
@@ -1955,12 +1979,12 @@
       <w:spacing w:before="240" w:after="120"/>
     </w:pPr>
     <w:rPr>
-      <w:rFonts w:ascii="Liberation Sans" w:hAnsi="Liberation Sans" w:eastAsia="Microsoft YaHei" w:cs="Arial Unicode MS"/>
+      <w:rFonts w:ascii="Liberation Sans" w:hAnsi="Liberation Sans" w:eastAsia="Microsoft YaHei" w:cs="Lucida Sans"/>
       <w:sz w:val="28"/>
       <w:szCs w:val="28"/>
     </w:rPr>
   </w:style>
-  <w:style w:type="paragraph" w:styleId="user1">
+  <w:style w:type="paragraph" w:styleId="user2">
     <w:name w:val="Покажчик (user)"/>
     <w:basedOn w:val="Normal"/>
     <w:qFormat/>
@@ -1968,12 +1992,12 @@
       <w:suppressLineNumbers/>
     </w:pPr>
     <w:rPr>
-      <w:rFonts w:cs="Arial Unicode MS"/>
+      <w:rFonts w:cs="Lucida Sans"/>
     </w:rPr>
   </w:style>
   <w:style w:type="paragraph" w:styleId="IndexHeading">
     <w:name w:val="index heading"/>
-    <w:basedOn w:val="user"/>
+    <w:basedOn w:val="Style12"/>
     <w:pPr/>
     <w:rPr/>
   </w:style>
@@ -2248,8 +2272,8 @@
     </w:pPr>
     <w:rPr/>
   </w:style>
-  <w:style w:type="numbering" w:styleId="user2" w:default="1">
-    <w:name w:val="Без маркерів (user)"/>
+  <w:style w:type="numbering" w:styleId="Style14" w:default="1">
+    <w:name w:val="Без маркерів"/>
     <w:uiPriority w:val="99"/>
     <w:semiHidden/>
     <w:unhideWhenUsed/>

</xml_diff>

<commit_message>
feat -- NI: making the report
</commit_message>
<xml_diff>
--- a/42NI Nejroiformatyka/1/NI_KNT-122_Onyshchenko_19_PR1.docx
+++ b/42NI Nejroiformatyka/1/NI_KNT-122_Onyshchenko_19_PR1.docx
@@ -1066,6 +1066,16 @@
       </w:pPr>
       <w:r>
         <w:rPr/>
+        <w:t>Нейрони можуть навчатися, підлаштовуючи свої ваги на основі прикладів (навчання з учителем).</w:t>
+      </w:r>
+    </w:p>
+    <w:p>
+      <w:pPr>
+        <w:pStyle w:val="P1"/>
+        <w:rPr/>
+      </w:pPr>
+      <w:r>
+        <w:rPr/>
       </w:r>
     </w:p>
     <w:p>
@@ -1080,12 +1090,274 @@
     </w:p>
     <w:p>
       <w:pPr>
+        <w:pStyle w:val="P1"/>
+        <w:rPr/>
+      </w:pPr>
+      <w:r>
+        <w:rPr/>
+      </w:r>
+    </w:p>
+    <w:p>
+      <w:pPr>
+        <w:pStyle w:val="P1"/>
+        <w:rPr/>
+      </w:pPr>
+      <w:r>
+        <w:rPr/>
+        <w:t>- формальний нейро</w:t>
+      </w:r>
+      <w:r>
+        <w:rPr/>
+        <w:t>н — математична модель біологічного нейрону;</w:t>
+      </w:r>
+    </w:p>
+    <w:p>
+      <w:pPr>
+        <w:pStyle w:val="P1"/>
+        <w:rPr/>
+      </w:pPr>
+      <w:r>
+        <w:rPr/>
+        <w:t xml:space="preserve">- синапс — </w:t>
+      </w:r>
+      <w:r>
+        <w:rPr/>
+        <w:t>зв’язок;</w:t>
+      </w:r>
+    </w:p>
+    <w:p>
+      <w:pPr>
+        <w:pStyle w:val="P1"/>
+        <w:rPr/>
+      </w:pPr>
+      <w:r>
+        <w:rPr/>
+        <w:t xml:space="preserve">- вага (ваговий коефіцієнт) — </w:t>
+      </w:r>
+      <w:r>
+        <w:rPr/>
+        <w:t>параметр, що визначає силу впливу сигналу на нейрон;</w:t>
+      </w:r>
+    </w:p>
+    <w:p>
+      <w:pPr>
+        <w:pStyle w:val="P1"/>
+        <w:rPr/>
+      </w:pPr>
+      <w:r>
+        <w:rPr/>
+        <w:t xml:space="preserve">- поріг — </w:t>
+      </w:r>
+      <w:r>
+        <w:rPr/>
+        <w:t>параметр, що зміщує функцію активації;</w:t>
+      </w:r>
+    </w:p>
+    <w:p>
+      <w:pPr>
+        <w:pStyle w:val="P1"/>
+        <w:rPr/>
+      </w:pPr>
+      <w:r>
+        <w:rPr/>
+        <w:t xml:space="preserve">- дискримінантна (вагова) функція - </w:t>
+      </w:r>
+    </w:p>
+    <w:p>
+      <w:pPr>
+        <w:pStyle w:val="P1"/>
+        <w:rPr/>
+      </w:pPr>
+      <w:r>
+        <w:rPr/>
+        <w:t xml:space="preserve">- функція активації — </w:t>
+      </w:r>
+      <w:r>
+        <w:rPr/>
+        <w:t>перетворює сумарний сигнал на вихідний;</w:t>
+      </w:r>
+    </w:p>
+    <w:p>
+      <w:pPr>
+        <w:pStyle w:val="P1"/>
+        <w:rPr/>
+      </w:pPr>
+      <w:r>
+        <w:rPr/>
+        <w:t xml:space="preserve">- бажаний і реальний вихід нейромережі — </w:t>
+      </w:r>
+      <w:r>
+        <w:rPr/>
+        <w:t>бажаний це те що має бути за еталоном, реальний це те що обчислила мережа;</w:t>
+      </w:r>
+    </w:p>
+    <w:p>
+      <w:pPr>
+        <w:pStyle w:val="P1"/>
+        <w:rPr/>
+      </w:pPr>
+      <w:r>
+        <w:rPr/>
+        <w:t xml:space="preserve">- навчання нейромережі - </w:t>
+      </w:r>
+    </w:p>
+    <w:p>
+      <w:pPr>
+        <w:pStyle w:val="P1"/>
+        <w:rPr/>
+      </w:pPr>
+      <w:r>
+        <w:rPr/>
+        <w:t xml:space="preserve">- класифікація — </w:t>
+      </w:r>
+      <w:r>
+        <w:rPr/>
+        <w:t>віднесення до групи;</w:t>
+      </w:r>
+    </w:p>
+    <w:p>
+      <w:pPr>
+        <w:pStyle w:val="P1"/>
+        <w:rPr/>
+      </w:pPr>
+      <w:r>
+        <w:rPr/>
+        <w:t xml:space="preserve">- апроксимація — </w:t>
+      </w:r>
+      <w:r>
+        <w:rPr/>
+        <w:t>обчислення неперервного значення;</w:t>
+      </w:r>
+    </w:p>
+    <w:p>
+      <w:pPr>
+        <w:pStyle w:val="P1"/>
+        <w:rPr/>
+      </w:pPr>
+      <w:r>
+        <w:rPr/>
+        <w:t xml:space="preserve">- оцінювання - </w:t>
+      </w:r>
+    </w:p>
+    <w:p>
+      <w:pPr>
+        <w:pStyle w:val="P1"/>
+        <w:rPr/>
+      </w:pPr>
+      <w:r>
+        <w:rPr/>
+        <w:t xml:space="preserve">- помилка навчання / класифікації - </w:t>
+      </w:r>
+    </w:p>
+    <w:p>
+      <w:pPr>
+        <w:pStyle w:val="P1"/>
+        <w:rPr/>
+      </w:pPr>
+      <w:r>
+        <w:rPr/>
+        <w:t xml:space="preserve">- час навчання / класифікації — </w:t>
+      </w:r>
+      <w:r>
+        <w:rPr/>
+        <w:t>навчання це час на підбір ваг, а класифікація це час отримання результатів;</w:t>
+      </w:r>
+    </w:p>
+    <w:p>
+      <w:pPr>
+        <w:pStyle w:val="P1"/>
+        <w:rPr/>
+      </w:pPr>
+      <w:r>
+        <w:rPr/>
+        <w:t xml:space="preserve">- цільова функція навчання - </w:t>
+      </w:r>
+    </w:p>
+    <w:p>
+      <w:pPr>
+        <w:pStyle w:val="P1"/>
+        <w:rPr/>
+      </w:pPr>
+      <w:r>
+        <w:rPr/>
+      </w:r>
+    </w:p>
+    <w:p>
+      <w:pPr>
         <w:pStyle w:val="H2"/>
         <w:rPr/>
       </w:pPr>
       <w:r>
         <w:rPr/>
-        <w:t>29 Опишіть  суть  узагальненого  градієнтного  алгоритму.  Окремі випадки узагальненого градієнтного алгоритму.</w:t>
+        <w:t>29 Опишіть  суть  узагальненого  градієнтного  алгоритму. Окремі випадки узагальненого градієнтного алгоритму.</w:t>
+      </w:r>
+    </w:p>
+    <w:p>
+      <w:pPr>
+        <w:pStyle w:val="P1"/>
+        <w:rPr/>
+      </w:pPr>
+      <w:r>
+        <w:rPr/>
+      </w:r>
+    </w:p>
+    <w:p>
+      <w:pPr>
+        <w:pStyle w:val="P1"/>
+        <w:rPr/>
+      </w:pPr>
+      <w:r>
+        <w:rPr/>
+        <w:t>Суть методу полягає в покроковій зміні ваг у напрямку, протилежному до градієнта функції помилки.</w:t>
+      </w:r>
+    </w:p>
+    <w:p>
+      <w:pPr>
+        <w:pStyle w:val="P1"/>
+        <w:rPr/>
+      </w:pPr>
+      <w:r>
+        <w:rPr/>
+        <w:t>Окремі випадки:</w:t>
+      </w:r>
+    </w:p>
+    <w:p>
+      <w:pPr>
+        <w:pStyle w:val="P1"/>
+        <w:rPr/>
+      </w:pPr>
+      <w:r>
+        <w:rPr/>
+        <w:t>- зворотнє поширення помилки — градієнт обчислюється від виходу до входу через усі шари;</w:t>
+      </w:r>
+    </w:p>
+    <w:p>
+      <w:pPr>
+        <w:pStyle w:val="P1"/>
+        <w:rPr/>
+      </w:pPr>
+      <w:r>
+        <w:rPr/>
+        <w:t>- метод найшвидшого спуску — крок підбирається оптимально на кожній ітерації;</w:t>
+      </w:r>
+    </w:p>
+    <w:p>
+      <w:pPr>
+        <w:pStyle w:val="P1"/>
+        <w:rPr/>
+      </w:pPr>
+      <w:r>
+        <w:rPr/>
+        <w:t>- стохастичний градієнтний спуск — ваги оновлюються після кожного окремого прикладу, а не після всієї вибірки.</w:t>
+      </w:r>
+    </w:p>
+    <w:p>
+      <w:pPr>
+        <w:pStyle w:val="P1"/>
+        <w:rPr/>
+      </w:pPr>
+      <w:r>
+        <w:rPr/>
       </w:r>
     </w:p>
     <w:p>
@@ -1100,12 +1372,89 @@
     </w:p>
     <w:p>
       <w:pPr>
+        <w:pStyle w:val="P1"/>
+        <w:rPr/>
+      </w:pPr>
+      <w:r>
+        <w:rPr/>
+      </w:r>
+    </w:p>
+    <w:p>
+      <w:pPr>
+        <w:pStyle w:val="P1"/>
+        <w:rPr/>
+      </w:pPr>
+      <w:r>
+        <w:rPr/>
+        <w:t>У радіально-базисних мережах (RBF) навчання часто розділене на два етапи, і кластер-аналіз (наприклад, метод k-середніх) використовується на першому:</w:t>
+      </w:r>
+    </w:p>
+    <w:p>
+      <w:pPr>
+        <w:pStyle w:val="P1"/>
+        <w:rPr/>
+      </w:pPr>
+      <w:r>
+        <w:rPr/>
+        <w:t xml:space="preserve">1. Щоб визначити </w:t>
+      </w:r>
+      <w:r>
+        <w:rPr>
+          <w:lang w:val="uk-UA"/>
+        </w:rPr>
+        <w:t>центри радіальних функцій у прихованому шарі;</w:t>
+      </w:r>
+    </w:p>
+    <w:p>
+      <w:pPr>
+        <w:pStyle w:val="P1"/>
+        <w:rPr>
+          <w:lang w:val="uk-UA"/>
+        </w:rPr>
+      </w:pPr>
+      <w:r>
+        <w:rPr>
+          <w:lang w:val="uk-UA"/>
+        </w:rPr>
+        <w:t>2. Це дозволяє прихованому шару максимально точно "покрити" простір вхідних ознак.</w:t>
+      </w:r>
+    </w:p>
+    <w:p>
+      <w:pPr>
+        <w:pStyle w:val="P1"/>
+        <w:rPr/>
+      </w:pPr>
+      <w:r>
+        <w:rPr/>
+      </w:r>
+    </w:p>
+    <w:p>
+      <w:pPr>
         <w:pStyle w:val="H2"/>
         <w:rPr/>
       </w:pPr>
       <w:r>
         <w:rPr/>
-        <w:t>49 Чи  впливає  репрезентативність  тестової  вибірки  на  точність навчання персептрона по навчальній вибірці?</w:t>
+        <w:t>49 Чи  впливає  репрезентативність  тестової  вибірки  на точність навчання персептрона по навчальній вибірці?</w:t>
+      </w:r>
+    </w:p>
+    <w:p>
+      <w:pPr>
+        <w:pStyle w:val="P1"/>
+        <w:rPr/>
+      </w:pPr>
+      <w:r>
+        <w:rPr/>
+      </w:r>
+    </w:p>
+    <w:p>
+      <w:pPr>
+        <w:pStyle w:val="P1"/>
+        <w:rPr/>
+      </w:pPr>
+      <w:r>
+        <w:rPr/>
+        <w:t>Не впливає.</w:t>
       </w:r>
     </w:p>
     <w:sectPr>
@@ -1906,12 +2255,12 @@
       <w:lang w:val="en-US" w:eastAsia="uk-UA"/>
     </w:rPr>
   </w:style>
-  <w:style w:type="character" w:styleId="user">
-    <w:name w:val="Символ нумерації (user)"/>
+  <w:style w:type="character" w:styleId="Style12">
+    <w:name w:val="Символ нумерації"/>
     <w:qFormat/>
     <w:rPr/>
   </w:style>
-  <w:style w:type="paragraph" w:styleId="Style12">
+  <w:style w:type="paragraph" w:styleId="Style13">
     <w:name w:val="Заголовок"/>
     <w:basedOn w:val="Normal"/>
     <w:next w:val="BodyText"/>
@@ -1921,7 +2270,7 @@
       <w:spacing w:before="240" w:after="120"/>
     </w:pPr>
     <w:rPr>
-      <w:rFonts w:ascii="Liberation Sans" w:hAnsi="Liberation Sans" w:eastAsia="Microsoft YaHei" w:cs="Arial Unicode MS"/>
+      <w:rFonts w:ascii="Liberation Sans" w:hAnsi="Liberation Sans" w:eastAsia="Microsoft YaHei" w:cs="Lucida Sans"/>
       <w:sz w:val="28"/>
       <w:szCs w:val="28"/>
     </w:rPr>
@@ -1958,7 +2307,7 @@
       <w:szCs w:val="24"/>
     </w:rPr>
   </w:style>
-  <w:style w:type="paragraph" w:styleId="Style13">
+  <w:style w:type="paragraph" w:styleId="Style14">
     <w:name w:val="Покажчик"/>
     <w:basedOn w:val="Normal"/>
     <w:qFormat/>
@@ -1966,10 +2315,10 @@
       <w:suppressLineNumbers/>
     </w:pPr>
     <w:rPr>
-      <w:rFonts w:cs="Arial Unicode MS"/>
-    </w:rPr>
-  </w:style>
-  <w:style w:type="paragraph" w:styleId="user1">
+      <w:rFonts w:cs="Lucida Sans"/>
+    </w:rPr>
+  </w:style>
+  <w:style w:type="paragraph" w:styleId="user">
     <w:name w:val="Заголовок (user)"/>
     <w:basedOn w:val="Normal"/>
     <w:next w:val="BodyText"/>
@@ -1979,12 +2328,12 @@
       <w:spacing w:before="240" w:after="120"/>
     </w:pPr>
     <w:rPr>
-      <w:rFonts w:ascii="Liberation Sans" w:hAnsi="Liberation Sans" w:eastAsia="Microsoft YaHei" w:cs="Lucida Sans"/>
+      <w:rFonts w:ascii="Liberation Sans" w:hAnsi="Liberation Sans" w:eastAsia="Microsoft YaHei" w:cs="Arial Unicode MS"/>
       <w:sz w:val="28"/>
       <w:szCs w:val="28"/>
     </w:rPr>
   </w:style>
-  <w:style w:type="paragraph" w:styleId="user2">
+  <w:style w:type="paragraph" w:styleId="user1">
     <w:name w:val="Покажчик (user)"/>
     <w:basedOn w:val="Normal"/>
     <w:qFormat/>
@@ -1992,12 +2341,12 @@
       <w:suppressLineNumbers/>
     </w:pPr>
     <w:rPr>
-      <w:rFonts w:cs="Lucida Sans"/>
+      <w:rFonts w:cs="Arial Unicode MS"/>
     </w:rPr>
   </w:style>
   <w:style w:type="paragraph" w:styleId="IndexHeading">
     <w:name w:val="index heading"/>
-    <w:basedOn w:val="Style12"/>
+    <w:basedOn w:val="user"/>
     <w:pPr/>
     <w:rPr/>
   </w:style>
@@ -2272,8 +2621,8 @@
     </w:pPr>
     <w:rPr/>
   </w:style>
-  <w:style w:type="numbering" w:styleId="Style14" w:default="1">
-    <w:name w:val="Без маркерів"/>
+  <w:style w:type="numbering" w:styleId="user2" w:default="1">
+    <w:name w:val="Без маркерів (user)"/>
     <w:uiPriority w:val="99"/>
     <w:semiHidden/>
     <w:unhideWhenUsed/>

</xml_diff>

<commit_message>
feat -- NI: copying code
</commit_message>
<xml_diff>
--- a/42NI Nejroiformatyka/1/NI_KNT-122_Onyshchenko_19_PR1.docx
+++ b/42NI Nejroiformatyka/1/NI_KNT-122_Onyshchenko_19_PR1.docx
@@ -1022,6 +1022,66 @@
     </w:p>
     <w:p>
       <w:pPr>
+        <w:pStyle w:val="H2"/>
+        <w:rPr/>
+      </w:pPr>
+      <w:r>
+        <w:rPr/>
+        <w:t>Теорія</w:t>
+      </w:r>
+    </w:p>
+    <w:p>
+      <w:pPr>
+        <w:pStyle w:val="H2"/>
+        <w:rPr/>
+      </w:pPr>
+      <w:r>
+        <w:rPr/>
+        <w:t>Процес</w:t>
+      </w:r>
+    </w:p>
+    <w:p>
+      <w:pPr>
+        <w:pStyle w:val="H2"/>
+        <w:rPr/>
+      </w:pPr>
+      <w:r>
+        <w:rPr/>
+        <w:t>Код</w:t>
+      </w:r>
+    </w:p>
+    <w:p>
+      <w:pPr>
+        <w:pStyle w:val="H2"/>
+        <w:rPr/>
+      </w:pPr>
+      <w:r>
+        <w:rPr/>
+        <w:t>Вхідні дані та результати</w:t>
+      </w:r>
+    </w:p>
+    <w:p>
+      <w:pPr>
+        <w:pStyle w:val="H2"/>
+        <w:rPr/>
+      </w:pPr>
+      <w:r>
+        <w:rPr/>
+        <w:t>Таблиці</w:t>
+      </w:r>
+    </w:p>
+    <w:p>
+      <w:pPr>
+        <w:pStyle w:val="H2"/>
+        <w:rPr/>
+      </w:pPr>
+      <w:r>
+        <w:rPr/>
+        <w:t>Графіки</w:t>
+      </w:r>
+    </w:p>
+    <w:p>
+      <w:pPr>
         <w:pStyle w:val="h11"/>
         <w:rPr/>
       </w:pPr>
@@ -1104,53 +1164,37 @@
       </w:pPr>
       <w:r>
         <w:rPr/>
-        <w:t>- формальний нейро</w:t>
-      </w:r>
-      <w:r>
-        <w:rPr/>
-        <w:t>н — математична модель біологічного нейрону;</w:t>
-      </w:r>
-    </w:p>
-    <w:p>
-      <w:pPr>
-        <w:pStyle w:val="P1"/>
-        <w:rPr/>
-      </w:pPr>
-      <w:r>
-        <w:rPr/>
-        <w:t xml:space="preserve">- синапс — </w:t>
-      </w:r>
-      <w:r>
-        <w:rPr/>
-        <w:t>зв’язок;</w:t>
-      </w:r>
-    </w:p>
-    <w:p>
-      <w:pPr>
-        <w:pStyle w:val="P1"/>
-        <w:rPr/>
-      </w:pPr>
-      <w:r>
-        <w:rPr/>
-        <w:t xml:space="preserve">- вага (ваговий коефіцієнт) — </w:t>
-      </w:r>
-      <w:r>
-        <w:rPr/>
-        <w:t>параметр, що визначає силу впливу сигналу на нейрон;</w:t>
-      </w:r>
-    </w:p>
-    <w:p>
-      <w:pPr>
-        <w:pStyle w:val="P1"/>
-        <w:rPr/>
-      </w:pPr>
-      <w:r>
-        <w:rPr/>
-        <w:t xml:space="preserve">- поріг — </w:t>
-      </w:r>
-      <w:r>
-        <w:rPr/>
-        <w:t>параметр, що зміщує функцію активації;</w:t>
+        <w:t>- формальний нейрон — математична модель біологічного нейрону;</w:t>
+      </w:r>
+    </w:p>
+    <w:p>
+      <w:pPr>
+        <w:pStyle w:val="P1"/>
+        <w:rPr/>
+      </w:pPr>
+      <w:r>
+        <w:rPr/>
+        <w:t>- синапс — зв’язок;</w:t>
+      </w:r>
+    </w:p>
+    <w:p>
+      <w:pPr>
+        <w:pStyle w:val="P1"/>
+        <w:rPr/>
+      </w:pPr>
+      <w:r>
+        <w:rPr/>
+        <w:t>- вага (ваговий коефіцієнт) — параметр, що визначає силу впливу сигналу на нейрон;</w:t>
+      </w:r>
+    </w:p>
+    <w:p>
+      <w:pPr>
+        <w:pStyle w:val="P1"/>
+        <w:rPr/>
+      </w:pPr>
+      <w:r>
+        <w:rPr/>
+        <w:t>- поріг — параметр, що зміщує функцію активації;</w:t>
       </w:r>
     </w:p>
     <w:p>
@@ -1170,25 +1214,17 @@
       </w:pPr>
       <w:r>
         <w:rPr/>
-        <w:t xml:space="preserve">- функція активації — </w:t>
-      </w:r>
-      <w:r>
-        <w:rPr/>
-        <w:t>перетворює сумарний сигнал на вихідний;</w:t>
-      </w:r>
-    </w:p>
-    <w:p>
-      <w:pPr>
-        <w:pStyle w:val="P1"/>
-        <w:rPr/>
-      </w:pPr>
-      <w:r>
-        <w:rPr/>
-        <w:t xml:space="preserve">- бажаний і реальний вихід нейромережі — </w:t>
-      </w:r>
-      <w:r>
-        <w:rPr/>
-        <w:t>бажаний це те що має бути за еталоном, реальний це те що обчислила мережа;</w:t>
+        <w:t>- функція активації — перетворює сумарний сигнал на вихідний;</w:t>
+      </w:r>
+    </w:p>
+    <w:p>
+      <w:pPr>
+        <w:pStyle w:val="P1"/>
+        <w:rPr/>
+      </w:pPr>
+      <w:r>
+        <w:rPr/>
+        <w:t>- бажаний і реальний вихід нейромережі — бажаний це те що має бути за еталоном, реальний це те що обчислила мережа;</w:t>
       </w:r>
     </w:p>
     <w:p>
@@ -1208,25 +1244,17 @@
       </w:pPr>
       <w:r>
         <w:rPr/>
-        <w:t xml:space="preserve">- класифікація — </w:t>
-      </w:r>
-      <w:r>
-        <w:rPr/>
-        <w:t>віднесення до групи;</w:t>
-      </w:r>
-    </w:p>
-    <w:p>
-      <w:pPr>
-        <w:pStyle w:val="P1"/>
-        <w:rPr/>
-      </w:pPr>
-      <w:r>
-        <w:rPr/>
-        <w:t xml:space="preserve">- апроксимація — </w:t>
-      </w:r>
-      <w:r>
-        <w:rPr/>
-        <w:t>обчислення неперервного значення;</w:t>
+        <w:t>- класифікація — віднесення до групи;</w:t>
+      </w:r>
+    </w:p>
+    <w:p>
+      <w:pPr>
+        <w:pStyle w:val="P1"/>
+        <w:rPr/>
+      </w:pPr>
+      <w:r>
+        <w:rPr/>
+        <w:t>- апроксимація — обчислення неперервного значення;</w:t>
       </w:r>
     </w:p>
     <w:p>
@@ -1256,11 +1284,7 @@
       </w:pPr>
       <w:r>
         <w:rPr/>
-        <w:t xml:space="preserve">- час навчання / класифікації — </w:t>
-      </w:r>
-      <w:r>
-        <w:rPr/>
-        <w:t>навчання це час на підбір ваг, а класифікація це час отримання результатів;</w:t>
+        <w:t>- час навчання / класифікації — навчання це час на підбір ваг, а класифікація це час отримання результатів;</w:t>
       </w:r>
     </w:p>
     <w:p>
@@ -2255,12 +2279,12 @@
       <w:lang w:val="en-US" w:eastAsia="uk-UA"/>
     </w:rPr>
   </w:style>
-  <w:style w:type="character" w:styleId="Style12">
-    <w:name w:val="Символ нумерації"/>
+  <w:style w:type="character" w:styleId="user">
+    <w:name w:val="Символ нумерації (user)"/>
     <w:qFormat/>
     <w:rPr/>
   </w:style>
-  <w:style w:type="paragraph" w:styleId="Style13">
+  <w:style w:type="paragraph" w:styleId="Style12">
     <w:name w:val="Заголовок"/>
     <w:basedOn w:val="Normal"/>
     <w:next w:val="BodyText"/>
@@ -2270,7 +2294,7 @@
       <w:spacing w:before="240" w:after="120"/>
     </w:pPr>
     <w:rPr>
-      <w:rFonts w:ascii="Liberation Sans" w:hAnsi="Liberation Sans" w:eastAsia="Microsoft YaHei" w:cs="Lucida Sans"/>
+      <w:rFonts w:ascii="Liberation Sans" w:hAnsi="Liberation Sans" w:eastAsia="Microsoft YaHei" w:cs="Arial Unicode MS"/>
       <w:sz w:val="28"/>
       <w:szCs w:val="28"/>
     </w:rPr>
@@ -2307,7 +2331,7 @@
       <w:szCs w:val="24"/>
     </w:rPr>
   </w:style>
-  <w:style w:type="paragraph" w:styleId="Style14">
+  <w:style w:type="paragraph" w:styleId="Style13">
     <w:name w:val="Покажчик"/>
     <w:basedOn w:val="Normal"/>
     <w:qFormat/>
@@ -2315,10 +2339,10 @@
       <w:suppressLineNumbers/>
     </w:pPr>
     <w:rPr>
-      <w:rFonts w:cs="Lucida Sans"/>
-    </w:rPr>
-  </w:style>
-  <w:style w:type="paragraph" w:styleId="user">
+      <w:rFonts w:cs="Arial Unicode MS"/>
+    </w:rPr>
+  </w:style>
+  <w:style w:type="paragraph" w:styleId="user1">
     <w:name w:val="Заголовок (user)"/>
     <w:basedOn w:val="Normal"/>
     <w:next w:val="BodyText"/>
@@ -2328,12 +2352,12 @@
       <w:spacing w:before="240" w:after="120"/>
     </w:pPr>
     <w:rPr>
-      <w:rFonts w:ascii="Liberation Sans" w:hAnsi="Liberation Sans" w:eastAsia="Microsoft YaHei" w:cs="Arial Unicode MS"/>
+      <w:rFonts w:ascii="Liberation Sans" w:hAnsi="Liberation Sans" w:eastAsia="Microsoft YaHei" w:cs="Lucida Sans"/>
       <w:sz w:val="28"/>
       <w:szCs w:val="28"/>
     </w:rPr>
   </w:style>
-  <w:style w:type="paragraph" w:styleId="user1">
+  <w:style w:type="paragraph" w:styleId="user2">
     <w:name w:val="Покажчик (user)"/>
     <w:basedOn w:val="Normal"/>
     <w:qFormat/>
@@ -2341,12 +2365,12 @@
       <w:suppressLineNumbers/>
     </w:pPr>
     <w:rPr>
-      <w:rFonts w:cs="Arial Unicode MS"/>
+      <w:rFonts w:cs="Lucida Sans"/>
     </w:rPr>
   </w:style>
   <w:style w:type="paragraph" w:styleId="IndexHeading">
     <w:name w:val="index heading"/>
-    <w:basedOn w:val="user"/>
+    <w:basedOn w:val="Style12"/>
     <w:pPr/>
     <w:rPr/>
   </w:style>
@@ -2621,8 +2645,8 @@
     </w:pPr>
     <w:rPr/>
   </w:style>
-  <w:style w:type="numbering" w:styleId="user2" w:default="1">
-    <w:name w:val="Без маркерів (user)"/>
+  <w:style w:type="numbering" w:styleId="Style14" w:default="1">
+    <w:name w:val="Без маркерів"/>
     <w:uiPriority w:val="99"/>
     <w:semiHidden/>
     <w:unhideWhenUsed/>

</xml_diff>

<commit_message>
docs -- NI: first lab done hopefully, Jesus help please
</commit_message>
<xml_diff>
--- a/42NI Nejroiformatyka/1/NI_KNT-122_Onyshchenko_19_PR1.docx
+++ b/42NI Nejroiformatyka/1/NI_KNT-122_Onyshchenko_19_PR1.docx
@@ -1027,7 +1027,1143 @@
       </w:pPr>
       <w:r>
         <w:rPr/>
-        <w:t>Теорія</w:t>
+        <w:t>Код</w:t>
+      </w:r>
+    </w:p>
+    <w:p>
+      <w:pPr>
+        <w:pStyle w:val="p11"/>
+        <w:rPr/>
+      </w:pPr>
+      <w:r>
+        <w:rPr/>
+      </w:r>
+    </w:p>
+    <w:p>
+      <w:pPr>
+        <w:pStyle w:val="Code"/>
+        <w:rPr>
+          <w:rFonts w:ascii="Consolas" w:hAnsi="Consolas"/>
+        </w:rPr>
+      </w:pPr>
+      <w:r>
+        <w:rPr>
+          <w:rFonts w:ascii="Consolas" w:hAnsi="Consolas"/>
+        </w:rPr>
+        <w:t>import time</w:t>
+      </w:r>
+    </w:p>
+    <w:p>
+      <w:pPr>
+        <w:pStyle w:val="Code"/>
+        <w:rPr>
+          <w:rFonts w:ascii="Consolas" w:hAnsi="Consolas"/>
+        </w:rPr>
+      </w:pPr>
+      <w:r>
+        <w:rPr>
+          <w:rFonts w:ascii="Consolas" w:hAnsi="Consolas"/>
+        </w:rPr>
+        <w:t>import numpy as np</w:t>
+      </w:r>
+    </w:p>
+    <w:p>
+      <w:pPr>
+        <w:pStyle w:val="Code"/>
+        <w:rPr>
+          <w:rFonts w:ascii="Consolas" w:hAnsi="Consolas"/>
+        </w:rPr>
+      </w:pPr>
+      <w:r>
+        <w:rPr>
+          <w:rFonts w:ascii="Consolas" w:hAnsi="Consolas"/>
+        </w:rPr>
+        <w:t>from matplotlib import pyplot as plt</w:t>
+      </w:r>
+    </w:p>
+    <w:p>
+      <w:pPr>
+        <w:pStyle w:val="Code"/>
+        <w:rPr>
+          <w:rFonts w:ascii="Consolas" w:hAnsi="Consolas"/>
+        </w:rPr>
+      </w:pPr>
+      <w:r>
+        <w:rPr>
+          <w:rFonts w:ascii="Consolas" w:hAnsi="Consolas"/>
+        </w:rPr>
+        <w:t>from sklearn.metrics import accuracy_score</w:t>
+      </w:r>
+    </w:p>
+    <w:p>
+      <w:pPr>
+        <w:pStyle w:val="Code"/>
+        <w:rPr>
+          <w:rFonts w:ascii="Consolas" w:hAnsi="Consolas"/>
+        </w:rPr>
+      </w:pPr>
+      <w:r>
+        <w:rPr>
+          <w:rFonts w:ascii="Consolas" w:hAnsi="Consolas"/>
+        </w:rPr>
+        <w:t>from sklearn.gaussian_process import GaussianProcessClassifier</w:t>
+      </w:r>
+    </w:p>
+    <w:p>
+      <w:pPr>
+        <w:pStyle w:val="Code"/>
+        <w:rPr>
+          <w:rFonts w:ascii="Consolas" w:hAnsi="Consolas"/>
+        </w:rPr>
+      </w:pPr>
+      <w:r>
+        <w:rPr>
+          <w:rFonts w:ascii="Consolas" w:hAnsi="Consolas"/>
+        </w:rPr>
+        <w:t>from sklearn.model_selection import train_test_split</w:t>
+      </w:r>
+    </w:p>
+    <w:p>
+      <w:pPr>
+        <w:pStyle w:val="Code"/>
+        <w:rPr>
+          <w:rFonts w:ascii="Consolas" w:hAnsi="Consolas"/>
+        </w:rPr>
+      </w:pPr>
+      <w:r>
+        <w:rPr>
+          <w:rFonts w:ascii="Consolas" w:hAnsi="Consolas"/>
+        </w:rPr>
+        <w:t>from sklearn.neural_network import MLPClassifier</w:t>
+      </w:r>
+    </w:p>
+    <w:p>
+      <w:pPr>
+        <w:pStyle w:val="Code"/>
+        <w:rPr>
+          <w:rFonts w:ascii="Consolas" w:hAnsi="Consolas"/>
+        </w:rPr>
+      </w:pPr>
+      <w:r>
+        <w:rPr>
+          <w:rFonts w:ascii="Consolas" w:hAnsi="Consolas"/>
+        </w:rPr>
+      </w:r>
+    </w:p>
+    <w:p>
+      <w:pPr>
+        <w:pStyle w:val="Code"/>
+        <w:rPr>
+          <w:rFonts w:ascii="Consolas" w:hAnsi="Consolas"/>
+        </w:rPr>
+      </w:pPr>
+      <w:r>
+        <w:rPr>
+          <w:rFonts w:ascii="Consolas" w:hAnsi="Consolas"/>
+        </w:rPr>
+        <w:t># 1. Підготовка фіктивних даних</w:t>
+      </w:r>
+    </w:p>
+    <w:p>
+      <w:pPr>
+        <w:pStyle w:val="Code"/>
+        <w:rPr>
+          <w:rFonts w:ascii="Consolas" w:hAnsi="Consolas"/>
+        </w:rPr>
+      </w:pPr>
+      <w:r>
+        <w:rPr>
+          <w:rFonts w:ascii="Consolas" w:hAnsi="Consolas"/>
+        </w:rPr>
+        <w:t># 18 вхідних ознак, 1 цільова</w:t>
+      </w:r>
+    </w:p>
+    <w:p>
+      <w:pPr>
+        <w:pStyle w:val="Code"/>
+        <w:rPr>
+          <w:rFonts w:ascii="Consolas" w:hAnsi="Consolas"/>
+        </w:rPr>
+      </w:pPr>
+      <w:r>
+        <w:rPr>
+          <w:rFonts w:ascii="Consolas" w:hAnsi="Consolas"/>
+        </w:rPr>
+        <w:t>X = np.random.rand(500, 18)</w:t>
+      </w:r>
+    </w:p>
+    <w:p>
+      <w:pPr>
+        <w:pStyle w:val="Code"/>
+        <w:rPr>
+          <w:rFonts w:ascii="Consolas" w:hAnsi="Consolas"/>
+        </w:rPr>
+      </w:pPr>
+      <w:r>
+        <w:rPr>
+          <w:rFonts w:ascii="Consolas" w:hAnsi="Consolas"/>
+        </w:rPr>
+        <w:t>y = np.random.randint(0, 2, 500)</w:t>
+      </w:r>
+    </w:p>
+    <w:p>
+      <w:pPr>
+        <w:pStyle w:val="Code"/>
+        <w:rPr>
+          <w:rFonts w:ascii="Consolas" w:hAnsi="Consolas"/>
+        </w:rPr>
+      </w:pPr>
+      <w:r>
+        <w:rPr>
+          <w:rFonts w:ascii="Consolas" w:hAnsi="Consolas"/>
+        </w:rPr>
+      </w:r>
+    </w:p>
+    <w:p>
+      <w:pPr>
+        <w:pStyle w:val="Code"/>
+        <w:rPr>
+          <w:rFonts w:ascii="Consolas" w:hAnsi="Consolas"/>
+        </w:rPr>
+      </w:pPr>
+      <w:r>
+        <w:rPr>
+          <w:rFonts w:ascii="Consolas" w:hAnsi="Consolas"/>
+        </w:rPr>
+        <w:t>X_train, X_test, y_train, y_test = train_test_split(</w:t>
+      </w:r>
+    </w:p>
+    <w:p>
+      <w:pPr>
+        <w:pStyle w:val="Code"/>
+        <w:rPr>
+          <w:rFonts w:ascii="Consolas" w:hAnsi="Consolas"/>
+        </w:rPr>
+      </w:pPr>
+      <w:r>
+        <w:rPr>
+          <w:rFonts w:ascii="Consolas" w:hAnsi="Consolas"/>
+        </w:rPr>
+        <w:t xml:space="preserve">    </w:t>
+      </w:r>
+      <w:r>
+        <w:rPr>
+          <w:rFonts w:ascii="Consolas" w:hAnsi="Consolas"/>
+        </w:rPr>
+        <w:t>X, y, test_size=0.2, random_state=42</w:t>
+      </w:r>
+    </w:p>
+    <w:p>
+      <w:pPr>
+        <w:pStyle w:val="Code"/>
+        <w:rPr>
+          <w:rFonts w:ascii="Consolas" w:hAnsi="Consolas"/>
+        </w:rPr>
+      </w:pPr>
+      <w:r>
+        <w:rPr>
+          <w:rFonts w:ascii="Consolas" w:hAnsi="Consolas"/>
+        </w:rPr>
+        <w:t>)</w:t>
+      </w:r>
+    </w:p>
+    <w:p>
+      <w:pPr>
+        <w:pStyle w:val="Code"/>
+        <w:rPr>
+          <w:rFonts w:ascii="Consolas" w:hAnsi="Consolas"/>
+        </w:rPr>
+      </w:pPr>
+      <w:r>
+        <w:rPr>
+          <w:rFonts w:ascii="Consolas" w:hAnsi="Consolas"/>
+        </w:rPr>
+      </w:r>
+    </w:p>
+    <w:p>
+      <w:pPr>
+        <w:pStyle w:val="Code"/>
+        <w:rPr>
+          <w:rFonts w:ascii="Consolas" w:hAnsi="Consolas"/>
+        </w:rPr>
+      </w:pPr>
+      <w:r>
+        <w:rPr>
+          <w:rFonts w:ascii="Consolas" w:hAnsi="Consolas"/>
+        </w:rPr>
+        <w:t>learning_rates = [0.001, 0.01, 0.1, 0.5]</w:t>
+      </w:r>
+    </w:p>
+    <w:p>
+      <w:pPr>
+        <w:pStyle w:val="Code"/>
+        <w:rPr>
+          <w:rFonts w:ascii="Consolas" w:hAnsi="Consolas"/>
+        </w:rPr>
+      </w:pPr>
+      <w:r>
+        <w:rPr>
+          <w:rFonts w:ascii="Consolas" w:hAnsi="Consolas"/>
+        </w:rPr>
+        <w:t>train_times = []</w:t>
+      </w:r>
+    </w:p>
+    <w:p>
+      <w:pPr>
+        <w:pStyle w:val="Code"/>
+        <w:rPr>
+          <w:rFonts w:ascii="Consolas" w:hAnsi="Consolas"/>
+        </w:rPr>
+      </w:pPr>
+      <w:r>
+        <w:rPr>
+          <w:rFonts w:ascii="Consolas" w:hAnsi="Consolas"/>
+        </w:rPr>
+      </w:r>
+    </w:p>
+    <w:p>
+      <w:pPr>
+        <w:pStyle w:val="Code"/>
+        <w:rPr>
+          <w:rFonts w:ascii="Consolas" w:hAnsi="Consolas"/>
+        </w:rPr>
+      </w:pPr>
+      <w:r>
+        <w:rPr>
+          <w:rFonts w:ascii="Consolas" w:hAnsi="Consolas"/>
+        </w:rPr>
+        <w:t># 2. Дослідження впливу кроку навчання (learning_rate) - п. 6</w:t>
+      </w:r>
+    </w:p>
+    <w:p>
+      <w:pPr>
+        <w:pStyle w:val="Code"/>
+        <w:rPr>
+          <w:rFonts w:ascii="Consolas" w:hAnsi="Consolas"/>
+        </w:rPr>
+      </w:pPr>
+      <w:r>
+        <w:rPr>
+          <w:rFonts w:ascii="Consolas" w:hAnsi="Consolas"/>
+        </w:rPr>
+        <w:t>for rate in learning_rates:</w:t>
+      </w:r>
+    </w:p>
+    <w:p>
+      <w:pPr>
+        <w:pStyle w:val="Code"/>
+        <w:rPr>
+          <w:rFonts w:ascii="Consolas" w:hAnsi="Consolas"/>
+        </w:rPr>
+      </w:pPr>
+      <w:r>
+        <w:rPr>
+          <w:rFonts w:ascii="Consolas" w:hAnsi="Consolas"/>
+        </w:rPr>
+        <w:t xml:space="preserve">    </w:t>
+      </w:r>
+      <w:r>
+        <w:rPr>
+          <w:rFonts w:ascii="Consolas" w:hAnsi="Consolas"/>
+        </w:rPr>
+        <w:t>mlp = MLPClassifier(</w:t>
+      </w:r>
+    </w:p>
+    <w:p>
+      <w:pPr>
+        <w:pStyle w:val="Code"/>
+        <w:rPr>
+          <w:rFonts w:ascii="Consolas" w:hAnsi="Consolas"/>
+        </w:rPr>
+      </w:pPr>
+      <w:r>
+        <w:rPr>
+          <w:rFonts w:ascii="Consolas" w:hAnsi="Consolas"/>
+        </w:rPr>
+        <w:t xml:space="preserve">        </w:t>
+      </w:r>
+      <w:r>
+        <w:rPr>
+          <w:rFonts w:ascii="Consolas" w:hAnsi="Consolas"/>
+        </w:rPr>
+        <w:t>hidden_layer_sizes=(8,),</w:t>
+      </w:r>
+    </w:p>
+    <w:p>
+      <w:pPr>
+        <w:pStyle w:val="Code"/>
+        <w:rPr>
+          <w:rFonts w:ascii="Consolas" w:hAnsi="Consolas"/>
+        </w:rPr>
+      </w:pPr>
+      <w:r>
+        <w:rPr>
+          <w:rFonts w:ascii="Consolas" w:hAnsi="Consolas"/>
+        </w:rPr>
+        <w:t xml:space="preserve">        </w:t>
+      </w:r>
+      <w:r>
+        <w:rPr>
+          <w:rFonts w:ascii="Consolas" w:hAnsi="Consolas"/>
+        </w:rPr>
+        <w:t>activation="logistic",</w:t>
+      </w:r>
+    </w:p>
+    <w:p>
+      <w:pPr>
+        <w:pStyle w:val="Code"/>
+        <w:rPr>
+          <w:rFonts w:ascii="Consolas" w:hAnsi="Consolas"/>
+        </w:rPr>
+      </w:pPr>
+      <w:r>
+        <w:rPr>
+          <w:rFonts w:ascii="Consolas" w:hAnsi="Consolas"/>
+        </w:rPr>
+        <w:t xml:space="preserve">        </w:t>
+      </w:r>
+      <w:r>
+        <w:rPr>
+          <w:rFonts w:ascii="Consolas" w:hAnsi="Consolas"/>
+        </w:rPr>
+        <w:t>learning_rate_init=rate,</w:t>
+      </w:r>
+    </w:p>
+    <w:p>
+      <w:pPr>
+        <w:pStyle w:val="Code"/>
+        <w:rPr>
+          <w:rFonts w:ascii="Consolas" w:hAnsi="Consolas"/>
+        </w:rPr>
+      </w:pPr>
+      <w:r>
+        <w:rPr>
+          <w:rFonts w:ascii="Consolas" w:hAnsi="Consolas"/>
+        </w:rPr>
+        <w:t xml:space="preserve">        </w:t>
+      </w:r>
+      <w:r>
+        <w:rPr>
+          <w:rFonts w:ascii="Consolas" w:hAnsi="Consolas"/>
+        </w:rPr>
+        <w:t>max_iter=1000,</w:t>
+      </w:r>
+    </w:p>
+    <w:p>
+      <w:pPr>
+        <w:pStyle w:val="Code"/>
+        <w:rPr>
+          <w:rFonts w:ascii="Consolas" w:hAnsi="Consolas"/>
+        </w:rPr>
+      </w:pPr>
+      <w:r>
+        <w:rPr>
+          <w:rFonts w:ascii="Consolas" w:hAnsi="Consolas"/>
+        </w:rPr>
+        <w:t xml:space="preserve">    </w:t>
+      </w:r>
+      <w:r>
+        <w:rPr>
+          <w:rFonts w:ascii="Consolas" w:hAnsi="Consolas"/>
+        </w:rPr>
+        <w:t>)</w:t>
+      </w:r>
+    </w:p>
+    <w:p>
+      <w:pPr>
+        <w:pStyle w:val="Code"/>
+        <w:rPr>
+          <w:rFonts w:ascii="Consolas" w:hAnsi="Consolas"/>
+        </w:rPr>
+      </w:pPr>
+      <w:r>
+        <w:rPr>
+          <w:rFonts w:ascii="Consolas" w:hAnsi="Consolas"/>
+        </w:rPr>
+        <w:t xml:space="preserve">    </w:t>
+      </w:r>
+      <w:r>
+        <w:rPr>
+          <w:rFonts w:ascii="Consolas" w:hAnsi="Consolas"/>
+        </w:rPr>
+        <w:t>start = time.time()</w:t>
+      </w:r>
+    </w:p>
+    <w:p>
+      <w:pPr>
+        <w:pStyle w:val="Code"/>
+        <w:rPr>
+          <w:rFonts w:ascii="Consolas" w:hAnsi="Consolas"/>
+        </w:rPr>
+      </w:pPr>
+      <w:r>
+        <w:rPr>
+          <w:rFonts w:ascii="Consolas" w:hAnsi="Consolas"/>
+        </w:rPr>
+        <w:t xml:space="preserve">    </w:t>
+      </w:r>
+      <w:r>
+        <w:rPr>
+          <w:rFonts w:ascii="Consolas" w:hAnsi="Consolas"/>
+        </w:rPr>
+        <w:t>mlp.fit(X_train, y_train)</w:t>
+      </w:r>
+    </w:p>
+    <w:p>
+      <w:pPr>
+        <w:pStyle w:val="Code"/>
+        <w:rPr>
+          <w:rFonts w:ascii="Consolas" w:hAnsi="Consolas"/>
+        </w:rPr>
+      </w:pPr>
+      <w:r>
+        <w:rPr>
+          <w:rFonts w:ascii="Consolas" w:hAnsi="Consolas"/>
+        </w:rPr>
+        <w:t xml:space="preserve">    </w:t>
+      </w:r>
+      <w:r>
+        <w:rPr>
+          <w:rFonts w:ascii="Consolas" w:hAnsi="Consolas"/>
+        </w:rPr>
+        <w:t>end = time.time()</w:t>
+      </w:r>
+    </w:p>
+    <w:p>
+      <w:pPr>
+        <w:pStyle w:val="Code"/>
+        <w:rPr>
+          <w:rFonts w:ascii="Consolas" w:hAnsi="Consolas"/>
+        </w:rPr>
+      </w:pPr>
+      <w:r>
+        <w:rPr>
+          <w:rFonts w:ascii="Consolas" w:hAnsi="Consolas"/>
+        </w:rPr>
+        <w:t xml:space="preserve">    </w:t>
+      </w:r>
+      <w:r>
+        <w:rPr>
+          <w:rFonts w:ascii="Consolas" w:hAnsi="Consolas"/>
+        </w:rPr>
+        <w:t>train_times.append(end - start)</w:t>
+      </w:r>
+    </w:p>
+    <w:p>
+      <w:pPr>
+        <w:pStyle w:val="Code"/>
+        <w:rPr>
+          <w:rFonts w:ascii="Consolas" w:hAnsi="Consolas"/>
+        </w:rPr>
+      </w:pPr>
+      <w:r>
+        <w:rPr>
+          <w:rFonts w:ascii="Consolas" w:hAnsi="Consolas"/>
+        </w:rPr>
+      </w:r>
+    </w:p>
+    <w:p>
+      <w:pPr>
+        <w:pStyle w:val="Code"/>
+        <w:rPr>
+          <w:rFonts w:ascii="Consolas" w:hAnsi="Consolas"/>
+        </w:rPr>
+      </w:pPr>
+      <w:r>
+        <w:rPr>
+          <w:rFonts w:ascii="Consolas" w:hAnsi="Consolas"/>
+        </w:rPr>
+        <w:t># Побудова графіка</w:t>
+      </w:r>
+    </w:p>
+    <w:p>
+      <w:pPr>
+        <w:pStyle w:val="Code"/>
+        <w:rPr>
+          <w:rFonts w:ascii="Consolas" w:hAnsi="Consolas"/>
+        </w:rPr>
+      </w:pPr>
+      <w:r>
+        <w:rPr>
+          <w:rFonts w:ascii="Consolas" w:hAnsi="Consolas"/>
+        </w:rPr>
+        <w:t>plt.figure(figsize=(8, 4))</w:t>
+      </w:r>
+    </w:p>
+    <w:p>
+      <w:pPr>
+        <w:pStyle w:val="Code"/>
+        <w:rPr>
+          <w:rFonts w:ascii="Consolas" w:hAnsi="Consolas"/>
+        </w:rPr>
+      </w:pPr>
+      <w:r>
+        <w:rPr>
+          <w:rFonts w:ascii="Consolas" w:hAnsi="Consolas"/>
+        </w:rPr>
+        <w:t>plt.plot(learning_rates, train_times, marker="o", color="blue")</w:t>
+      </w:r>
+    </w:p>
+    <w:p>
+      <w:pPr>
+        <w:pStyle w:val="Code"/>
+        <w:rPr>
+          <w:rFonts w:ascii="Consolas" w:hAnsi="Consolas"/>
+        </w:rPr>
+      </w:pPr>
+      <w:r>
+        <w:rPr>
+          <w:rFonts w:ascii="Consolas" w:hAnsi="Consolas"/>
+        </w:rPr>
+        <w:t>plt.title("Залежність часу навчання від кроку (LR)")</w:t>
+      </w:r>
+    </w:p>
+    <w:p>
+      <w:pPr>
+        <w:pStyle w:val="Code"/>
+        <w:rPr>
+          <w:rFonts w:ascii="Consolas" w:hAnsi="Consolas"/>
+        </w:rPr>
+      </w:pPr>
+      <w:r>
+        <w:rPr>
+          <w:rFonts w:ascii="Consolas" w:hAnsi="Consolas"/>
+        </w:rPr>
+        <w:t>plt.xlabel("Learning Rate")</w:t>
+      </w:r>
+    </w:p>
+    <w:p>
+      <w:pPr>
+        <w:pStyle w:val="Code"/>
+        <w:rPr>
+          <w:rFonts w:ascii="Consolas" w:hAnsi="Consolas"/>
+        </w:rPr>
+      </w:pPr>
+      <w:r>
+        <w:rPr>
+          <w:rFonts w:ascii="Consolas" w:hAnsi="Consolas"/>
+        </w:rPr>
+        <w:t>plt.ylabel("Час (с)")</w:t>
+      </w:r>
+    </w:p>
+    <w:p>
+      <w:pPr>
+        <w:pStyle w:val="Code"/>
+        <w:rPr>
+          <w:rFonts w:ascii="Consolas" w:hAnsi="Consolas"/>
+        </w:rPr>
+      </w:pPr>
+      <w:r>
+        <w:rPr>
+          <w:rFonts w:ascii="Consolas" w:hAnsi="Consolas"/>
+        </w:rPr>
+        <w:t>plt.grid(True)</w:t>
+      </w:r>
+    </w:p>
+    <w:p>
+      <w:pPr>
+        <w:pStyle w:val="Code"/>
+        <w:rPr>
+          <w:rFonts w:ascii="Consolas" w:hAnsi="Consolas"/>
+        </w:rPr>
+      </w:pPr>
+      <w:r>
+        <w:rPr>
+          <w:rFonts w:ascii="Consolas" w:hAnsi="Consolas"/>
+        </w:rPr>
+        <w:t>plt.show()</w:t>
+      </w:r>
+    </w:p>
+    <w:p>
+      <w:pPr>
+        <w:pStyle w:val="Code"/>
+        <w:rPr>
+          <w:rFonts w:ascii="Consolas" w:hAnsi="Consolas"/>
+        </w:rPr>
+      </w:pPr>
+      <w:r>
+        <w:rPr>
+          <w:rFonts w:ascii="Consolas" w:hAnsi="Consolas"/>
+        </w:rPr>
+      </w:r>
+    </w:p>
+    <w:p>
+      <w:pPr>
+        <w:pStyle w:val="Code"/>
+        <w:rPr>
+          <w:rFonts w:ascii="Consolas" w:hAnsi="Consolas"/>
+        </w:rPr>
+      </w:pPr>
+      <w:r>
+        <w:rPr>
+          <w:rFonts w:ascii="Consolas" w:hAnsi="Consolas"/>
+        </w:rPr>
+        <w:t># Порівняння моделей (п. 5, 8)</w:t>
+      </w:r>
+    </w:p>
+    <w:p>
+      <w:pPr>
+        <w:pStyle w:val="Code"/>
+        <w:rPr>
+          <w:rFonts w:ascii="Consolas" w:hAnsi="Consolas"/>
+        </w:rPr>
+      </w:pPr>
+      <w:r>
+        <w:rPr>
+          <w:rFonts w:ascii="Consolas" w:hAnsi="Consolas"/>
+        </w:rPr>
+        <w:t>models = {</w:t>
+      </w:r>
+    </w:p>
+    <w:p>
+      <w:pPr>
+        <w:pStyle w:val="Code"/>
+        <w:rPr>
+          <w:rFonts w:ascii="Consolas" w:hAnsi="Consolas"/>
+        </w:rPr>
+      </w:pPr>
+      <w:r>
+        <w:rPr>
+          <w:rFonts w:ascii="Consolas" w:hAnsi="Consolas"/>
+        </w:rPr>
+        <w:t xml:space="preserve">    </w:t>
+      </w:r>
+      <w:r>
+        <w:rPr>
+          <w:rFonts w:ascii="Consolas" w:hAnsi="Consolas"/>
+        </w:rPr>
+        <w:t>"SLP": MLPClassifier(hidden_layer_sizes=(), activation="logistic", max_iter=1000),</w:t>
+      </w:r>
+    </w:p>
+    <w:p>
+      <w:pPr>
+        <w:pStyle w:val="Code"/>
+        <w:rPr>
+          <w:rFonts w:ascii="Consolas" w:hAnsi="Consolas"/>
+        </w:rPr>
+      </w:pPr>
+      <w:r>
+        <w:rPr>
+          <w:rFonts w:ascii="Consolas" w:hAnsi="Consolas"/>
+        </w:rPr>
+        <w:t xml:space="preserve">    </w:t>
+      </w:r>
+      <w:r>
+        <w:rPr>
+          <w:rFonts w:ascii="Consolas" w:hAnsi="Consolas"/>
+        </w:rPr>
+        <w:t>"MLP (8-1)": MLPClassifier(</w:t>
+      </w:r>
+    </w:p>
+    <w:p>
+      <w:pPr>
+        <w:pStyle w:val="Code"/>
+        <w:rPr>
+          <w:rFonts w:ascii="Consolas" w:hAnsi="Consolas"/>
+        </w:rPr>
+      </w:pPr>
+      <w:r>
+        <w:rPr>
+          <w:rFonts w:ascii="Consolas" w:hAnsi="Consolas"/>
+        </w:rPr>
+        <w:t xml:space="preserve">        </w:t>
+      </w:r>
+      <w:r>
+        <w:rPr>
+          <w:rFonts w:ascii="Consolas" w:hAnsi="Consolas"/>
+        </w:rPr>
+        <w:t>hidden_layer_sizes=(8,), activation="logistic", max_iter=1000</w:t>
+      </w:r>
+    </w:p>
+    <w:p>
+      <w:pPr>
+        <w:pStyle w:val="Code"/>
+        <w:rPr>
+          <w:rFonts w:ascii="Consolas" w:hAnsi="Consolas"/>
+        </w:rPr>
+      </w:pPr>
+      <w:r>
+        <w:rPr>
+          <w:rFonts w:ascii="Consolas" w:hAnsi="Consolas"/>
+        </w:rPr>
+        <w:t xml:space="preserve">    </w:t>
+      </w:r>
+      <w:r>
+        <w:rPr>
+          <w:rFonts w:ascii="Consolas" w:hAnsi="Consolas"/>
+        </w:rPr>
+        <w:t>),</w:t>
+      </w:r>
+    </w:p>
+    <w:p>
+      <w:pPr>
+        <w:pStyle w:val="Code"/>
+        <w:rPr>
+          <w:rFonts w:ascii="Consolas" w:hAnsi="Consolas"/>
+        </w:rPr>
+      </w:pPr>
+      <w:r>
+        <w:rPr>
+          <w:rFonts w:ascii="Consolas" w:hAnsi="Consolas"/>
+        </w:rPr>
+        <w:t xml:space="preserve">    </w:t>
+      </w:r>
+      <w:r>
+        <w:rPr>
+          <w:rFonts w:ascii="Consolas" w:hAnsi="Consolas"/>
+        </w:rPr>
+        <w:t>"RBF": GaussianProcessClassifier(),</w:t>
+      </w:r>
+    </w:p>
+    <w:p>
+      <w:pPr>
+        <w:pStyle w:val="Code"/>
+        <w:rPr>
+          <w:rFonts w:ascii="Consolas" w:hAnsi="Consolas"/>
+        </w:rPr>
+      </w:pPr>
+      <w:r>
+        <w:rPr>
+          <w:rFonts w:ascii="Consolas" w:hAnsi="Consolas"/>
+        </w:rPr>
+        <w:t>}</w:t>
+      </w:r>
+    </w:p>
+    <w:p>
+      <w:pPr>
+        <w:pStyle w:val="Code"/>
+        <w:rPr>
+          <w:rFonts w:ascii="Consolas" w:hAnsi="Consolas"/>
+        </w:rPr>
+      </w:pPr>
+      <w:r>
+        <w:rPr>
+          <w:rFonts w:ascii="Consolas" w:hAnsi="Consolas"/>
+        </w:rPr>
+      </w:r>
+    </w:p>
+    <w:p>
+      <w:pPr>
+        <w:pStyle w:val="Code"/>
+        <w:rPr>
+          <w:rFonts w:ascii="Consolas" w:hAnsi="Consolas"/>
+        </w:rPr>
+      </w:pPr>
+      <w:r>
+        <w:rPr>
+          <w:rFonts w:ascii="Consolas" w:hAnsi="Consolas"/>
+        </w:rPr>
+        <w:t>results = []</w:t>
+      </w:r>
+    </w:p>
+    <w:p>
+      <w:pPr>
+        <w:pStyle w:val="Code"/>
+        <w:rPr>
+          <w:rFonts w:ascii="Consolas" w:hAnsi="Consolas"/>
+        </w:rPr>
+      </w:pPr>
+      <w:r>
+        <w:rPr>
+          <w:rFonts w:ascii="Consolas" w:hAnsi="Consolas"/>
+        </w:rPr>
+        <w:t>for name, model in models.items():</w:t>
+      </w:r>
+    </w:p>
+    <w:p>
+      <w:pPr>
+        <w:pStyle w:val="Code"/>
+        <w:rPr>
+          <w:rFonts w:ascii="Consolas" w:hAnsi="Consolas"/>
+        </w:rPr>
+      </w:pPr>
+      <w:r>
+        <w:rPr>
+          <w:rFonts w:ascii="Consolas" w:hAnsi="Consolas"/>
+        </w:rPr>
+        <w:t xml:space="preserve">    </w:t>
+      </w:r>
+      <w:r>
+        <w:rPr>
+          <w:rFonts w:ascii="Consolas" w:hAnsi="Consolas"/>
+        </w:rPr>
+        <w:t># Навчання</w:t>
+      </w:r>
+    </w:p>
+    <w:p>
+      <w:pPr>
+        <w:pStyle w:val="Code"/>
+        <w:rPr>
+          <w:rFonts w:ascii="Consolas" w:hAnsi="Consolas"/>
+        </w:rPr>
+      </w:pPr>
+      <w:r>
+        <w:rPr>
+          <w:rFonts w:ascii="Consolas" w:hAnsi="Consolas"/>
+        </w:rPr>
+        <w:t xml:space="preserve">    </w:t>
+      </w:r>
+      <w:r>
+        <w:rPr>
+          <w:rFonts w:ascii="Consolas" w:hAnsi="Consolas"/>
+        </w:rPr>
+        <w:t>start_train = time.time()</w:t>
+      </w:r>
+    </w:p>
+    <w:p>
+      <w:pPr>
+        <w:pStyle w:val="Code"/>
+        <w:rPr>
+          <w:rFonts w:ascii="Consolas" w:hAnsi="Consolas"/>
+        </w:rPr>
+      </w:pPr>
+      <w:r>
+        <w:rPr>
+          <w:rFonts w:ascii="Consolas" w:hAnsi="Consolas"/>
+        </w:rPr>
+        <w:t xml:space="preserve">    </w:t>
+      </w:r>
+      <w:r>
+        <w:rPr>
+          <w:rFonts w:ascii="Consolas" w:hAnsi="Consolas"/>
+        </w:rPr>
+        <w:t>model.fit(X_train, y_train)</w:t>
+      </w:r>
+    </w:p>
+    <w:p>
+      <w:pPr>
+        <w:pStyle w:val="Code"/>
+        <w:rPr>
+          <w:rFonts w:ascii="Consolas" w:hAnsi="Consolas"/>
+        </w:rPr>
+      </w:pPr>
+      <w:r>
+        <w:rPr>
+          <w:rFonts w:ascii="Consolas" w:hAnsi="Consolas"/>
+        </w:rPr>
+        <w:t xml:space="preserve">    </w:t>
+      </w:r>
+      <w:r>
+        <w:rPr>
+          <w:rFonts w:ascii="Consolas" w:hAnsi="Consolas"/>
+        </w:rPr>
+        <w:t>end_train = time.time()</w:t>
+      </w:r>
+    </w:p>
+    <w:p>
+      <w:pPr>
+        <w:pStyle w:val="Code"/>
+        <w:rPr>
+          <w:rFonts w:ascii="Consolas" w:hAnsi="Consolas"/>
+        </w:rPr>
+      </w:pPr>
+      <w:r>
+        <w:rPr>
+          <w:rFonts w:ascii="Consolas" w:hAnsi="Consolas"/>
+        </w:rPr>
+      </w:r>
+    </w:p>
+    <w:p>
+      <w:pPr>
+        <w:pStyle w:val="Code"/>
+        <w:rPr>
+          <w:rFonts w:ascii="Consolas" w:hAnsi="Consolas"/>
+        </w:rPr>
+      </w:pPr>
+      <w:r>
+        <w:rPr>
+          <w:rFonts w:ascii="Consolas" w:hAnsi="Consolas"/>
+        </w:rPr>
+        <w:t xml:space="preserve">    </w:t>
+      </w:r>
+      <w:r>
+        <w:rPr>
+          <w:rFonts w:ascii="Consolas" w:hAnsi="Consolas"/>
+        </w:rPr>
+        <w:t># Тестування</w:t>
+      </w:r>
+    </w:p>
+    <w:p>
+      <w:pPr>
+        <w:pStyle w:val="Code"/>
+        <w:rPr>
+          <w:rFonts w:ascii="Consolas" w:hAnsi="Consolas"/>
+        </w:rPr>
+      </w:pPr>
+      <w:r>
+        <w:rPr>
+          <w:rFonts w:ascii="Consolas" w:hAnsi="Consolas"/>
+        </w:rPr>
+        <w:t xml:space="preserve">    </w:t>
+      </w:r>
+      <w:r>
+        <w:rPr>
+          <w:rFonts w:ascii="Consolas" w:hAnsi="Consolas"/>
+        </w:rPr>
+        <w:t>start_test = time.time()</w:t>
+      </w:r>
+    </w:p>
+    <w:p>
+      <w:pPr>
+        <w:pStyle w:val="Code"/>
+        <w:rPr>
+          <w:rFonts w:ascii="Consolas" w:hAnsi="Consolas"/>
+        </w:rPr>
+      </w:pPr>
+      <w:r>
+        <w:rPr>
+          <w:rFonts w:ascii="Consolas" w:hAnsi="Consolas"/>
+        </w:rPr>
+        <w:t xml:space="preserve">    </w:t>
+      </w:r>
+      <w:r>
+        <w:rPr>
+          <w:rFonts w:ascii="Consolas" w:hAnsi="Consolas"/>
+        </w:rPr>
+        <w:t>predictions = model.predict(X_test)</w:t>
+      </w:r>
+    </w:p>
+    <w:p>
+      <w:pPr>
+        <w:pStyle w:val="Code"/>
+        <w:rPr>
+          <w:rFonts w:ascii="Consolas" w:hAnsi="Consolas"/>
+        </w:rPr>
+      </w:pPr>
+      <w:r>
+        <w:rPr>
+          <w:rFonts w:ascii="Consolas" w:hAnsi="Consolas"/>
+        </w:rPr>
+        <w:t xml:space="preserve">    </w:t>
+      </w:r>
+      <w:r>
+        <w:rPr>
+          <w:rFonts w:ascii="Consolas" w:hAnsi="Consolas"/>
+        </w:rPr>
+        <w:t>end_test = time.time()</w:t>
+      </w:r>
+    </w:p>
+    <w:p>
+      <w:pPr>
+        <w:pStyle w:val="Code"/>
+        <w:rPr>
+          <w:rFonts w:ascii="Consolas" w:hAnsi="Consolas"/>
+        </w:rPr>
+      </w:pPr>
+      <w:r>
+        <w:rPr>
+          <w:rFonts w:ascii="Consolas" w:hAnsi="Consolas"/>
+        </w:rPr>
+      </w:r>
+    </w:p>
+    <w:p>
+      <w:pPr>
+        <w:pStyle w:val="Code"/>
+        <w:rPr>
+          <w:rFonts w:ascii="Consolas" w:hAnsi="Consolas"/>
+        </w:rPr>
+      </w:pPr>
+      <w:r>
+        <w:rPr>
+          <w:rFonts w:ascii="Consolas" w:hAnsi="Consolas"/>
+        </w:rPr>
+        <w:t xml:space="preserve">    </w:t>
+      </w:r>
+      <w:r>
+        <w:rPr>
+          <w:rFonts w:ascii="Consolas" w:hAnsi="Consolas"/>
+        </w:rPr>
+        <w:t>accuracy = accuracy_score(y_test, predictions)</w:t>
+      </w:r>
+    </w:p>
+    <w:p>
+      <w:pPr>
+        <w:pStyle w:val="Code"/>
+        <w:rPr>
+          <w:rFonts w:ascii="Consolas" w:hAnsi="Consolas"/>
+        </w:rPr>
+      </w:pPr>
+      <w:r>
+        <w:rPr>
+          <w:rFonts w:ascii="Consolas" w:hAnsi="Consolas"/>
+        </w:rPr>
+        <w:t xml:space="preserve">    </w:t>
+      </w:r>
+      <w:r>
+        <w:rPr>
+          <w:rFonts w:ascii="Consolas" w:hAnsi="Consolas"/>
+        </w:rPr>
+        <w:t>results.append([name, end_train - start_train, 1 - accuracy])</w:t>
+      </w:r>
+    </w:p>
+    <w:p>
+      <w:pPr>
+        <w:pStyle w:val="Code"/>
+        <w:rPr>
+          <w:rFonts w:ascii="Consolas" w:hAnsi="Consolas"/>
+        </w:rPr>
+      </w:pPr>
+      <w:r>
+        <w:rPr>
+          <w:rFonts w:ascii="Consolas" w:hAnsi="Consolas"/>
+        </w:rPr>
+      </w:r>
+    </w:p>
+    <w:p>
+      <w:pPr>
+        <w:pStyle w:val="Code"/>
+        <w:rPr>
+          <w:rFonts w:ascii="Consolas" w:hAnsi="Consolas"/>
+        </w:rPr>
+      </w:pPr>
+      <w:r>
+        <w:rPr>
+          <w:rFonts w:ascii="Consolas" w:hAnsi="Consolas"/>
+        </w:rPr>
+        <w:t>print(f"{'Модель':&lt;10} | {'Час навчання':&lt;10} | {'Помилка':&lt;10}")</w:t>
+      </w:r>
+    </w:p>
+    <w:p>
+      <w:pPr>
+        <w:pStyle w:val="Code"/>
+        <w:rPr>
+          <w:rFonts w:ascii="Consolas" w:hAnsi="Consolas"/>
+        </w:rPr>
+      </w:pPr>
+      <w:r>
+        <w:rPr>
+          <w:rFonts w:ascii="Consolas" w:hAnsi="Consolas"/>
+        </w:rPr>
+        <w:t>for res in results:</w:t>
+      </w:r>
+    </w:p>
+    <w:p>
+      <w:pPr>
+        <w:pStyle w:val="Code"/>
+        <w:rPr>
+          <w:rFonts w:ascii="Consolas" w:hAnsi="Consolas"/>
+        </w:rPr>
+      </w:pPr>
+      <w:r>
+        <w:rPr>
+          <w:rFonts w:ascii="Consolas" w:hAnsi="Consolas"/>
+        </w:rPr>
+        <w:t xml:space="preserve">    </w:t>
+      </w:r>
+      <w:r>
+        <w:rPr>
+          <w:rFonts w:ascii="Consolas" w:hAnsi="Consolas"/>
+        </w:rPr>
+        <w:t>print(f"{res[0]:&lt;10} | {res[1]:.4f}s      | {res[2]:.4f}")</w:t>
+      </w:r>
+    </w:p>
+    <w:p>
+      <w:pPr>
+        <w:pStyle w:val="p11"/>
+        <w:rPr/>
+      </w:pPr>
+      <w:r>
+        <w:rPr/>
       </w:r>
     </w:p>
     <w:p>
@@ -1037,7 +2173,254 @@
       </w:pPr>
       <w:r>
         <w:rPr/>
-        <w:t>Процес</w:t>
+        <w:t>Результати</w:t>
+      </w:r>
+    </w:p>
+    <w:p>
+      <w:pPr>
+        <w:pStyle w:val="p11"/>
+        <w:rPr/>
+      </w:pPr>
+      <w:r>
+        <w:rPr/>
+      </w:r>
+    </w:p>
+    <w:p>
+      <w:pPr>
+        <w:pStyle w:val="p11"/>
+        <w:rPr/>
+      </w:pPr>
+      <w:r>
+        <w:rPr/>
+        <w:t>Вивід у консоль:</w:t>
+      </w:r>
+    </w:p>
+    <w:p>
+      <w:pPr>
+        <w:pStyle w:val="p11"/>
+        <w:rPr/>
+      </w:pPr>
+      <w:r>
+        <w:rPr/>
+      </w:r>
+    </w:p>
+    <w:p>
+      <w:pPr>
+        <w:pStyle w:val="Code"/>
+        <w:rPr>
+          <w:rFonts w:ascii="Consolas" w:hAnsi="Consolas"/>
+        </w:rPr>
+      </w:pPr>
+      <w:r>
+        <w:rPr>
+          <w:rFonts w:ascii="Consolas" w:hAnsi="Consolas"/>
+        </w:rPr>
+        <w:t xml:space="preserve">Модель     | Час навчання | Помилка   </w:t>
+      </w:r>
+    </w:p>
+    <w:p>
+      <w:pPr>
+        <w:pStyle w:val="Code"/>
+        <w:rPr>
+          <w:rFonts w:ascii="Consolas" w:hAnsi="Consolas"/>
+        </w:rPr>
+      </w:pPr>
+      <w:r>
+        <w:rPr>
+          <w:rFonts w:ascii="Consolas" w:hAnsi="Consolas"/>
+        </w:rPr>
+        <w:t>SLP        | 0.0721s      | 0.5200</w:t>
+      </w:r>
+    </w:p>
+    <w:p>
+      <w:pPr>
+        <w:pStyle w:val="Code"/>
+        <w:rPr>
+          <w:rFonts w:ascii="Consolas" w:hAnsi="Consolas"/>
+        </w:rPr>
+      </w:pPr>
+      <w:r>
+        <w:rPr>
+          <w:rFonts w:ascii="Consolas" w:hAnsi="Consolas"/>
+        </w:rPr>
+        <w:t>MLP (8-1)  | 0.0206s      | 0.5300</w:t>
+      </w:r>
+    </w:p>
+    <w:p>
+      <w:pPr>
+        <w:pStyle w:val="Code"/>
+        <w:rPr>
+          <w:rFonts w:ascii="Consolas" w:hAnsi="Consolas"/>
+        </w:rPr>
+      </w:pPr>
+      <w:r>
+        <w:rPr>
+          <w:rFonts w:ascii="Consolas" w:hAnsi="Consolas"/>
+        </w:rPr>
+        <w:t>RBF        | 0.0433s      | 0.5300</w:t>
+      </w:r>
+    </w:p>
+    <w:p>
+      <w:pPr>
+        <w:pStyle w:val="P1"/>
+        <w:rPr/>
+      </w:pPr>
+      <w:r>
+        <w:rPr/>
+      </w:r>
+    </w:p>
+    <w:p>
+      <w:pPr>
+        <w:pStyle w:val="P1"/>
+        <w:rPr/>
+      </w:pPr>
+      <w:r>
+        <w:rPr/>
+        <w:t>Вигляд графіку:</w:t>
+      </w:r>
+    </w:p>
+    <w:p>
+      <w:pPr>
+        <w:pStyle w:val="P1"/>
+        <w:rPr/>
+      </w:pPr>
+      <w:r>
+        <w:rPr/>
+      </w:r>
+    </w:p>
+    <w:p>
+      <w:pPr>
+        <w:pStyle w:val="img1"/>
+        <w:rPr/>
+      </w:pPr>
+      <w:r>
+        <w:rPr/>
+        <w:drawing>
+          <wp:inline distT="0" distB="0" distL="0" distR="0">
+            <wp:extent cx="5731510" cy="2865755"/>
+            <wp:effectExtent l="0" t="0" r="0" b="0"/>
+            <wp:docPr id="1" name="Зображення1"/>
+            <wp:cNvGraphicFramePr>
+              <a:graphicFrameLocks xmlns:a="http://schemas.openxmlformats.org/drawingml/2006/main" noChangeAspect="1"/>
+            </wp:cNvGraphicFramePr>
+            <a:graphic xmlns:a="http://schemas.openxmlformats.org/drawingml/2006/main">
+              <a:graphicData uri="http://schemas.openxmlformats.org/drawingml/2006/picture">
+                <pic:pic xmlns:pic="http://schemas.openxmlformats.org/drawingml/2006/picture">
+                  <pic:nvPicPr>
+                    <pic:cNvPr id="1" name="Зображення1"/>
+                    <pic:cNvPicPr>
+                      <a:picLocks noChangeAspect="1" noChangeArrowheads="1"/>
+                    </pic:cNvPicPr>
+                  </pic:nvPicPr>
+                  <pic:blipFill>
+                    <a:blip r:embed="rId2"/>
+                    <a:stretch>
+                      <a:fillRect/>
+                    </a:stretch>
+                  </pic:blipFill>
+                  <pic:spPr bwMode="auto">
+                    <a:xfrm>
+                      <a:off x="0" y="0"/>
+                      <a:ext cx="5731510" cy="2865755"/>
+                    </a:xfrm>
+                    <a:prstGeom prst="rect">
+                      <a:avLst/>
+                    </a:prstGeom>
+                    <a:noFill/>
+                  </pic:spPr>
+                </pic:pic>
+              </a:graphicData>
+            </a:graphic>
+          </wp:inline>
+        </w:drawing>
+      </w:r>
+    </w:p>
+    <w:p>
+      <w:pPr>
+        <w:pStyle w:val="img1"/>
+        <w:rPr/>
+      </w:pPr>
+      <w:r>
+        <w:rPr/>
+        <w:t>Рисунок 1.1 — Залежність часу навчання від кроку</w:t>
+      </w:r>
+    </w:p>
+    <w:p>
+      <w:pPr>
+        <w:pStyle w:val="P1"/>
+        <w:rPr/>
+      </w:pPr>
+      <w:r>
+        <w:rPr/>
+      </w:r>
+    </w:p>
+    <w:p>
+      <w:pPr>
+        <w:pStyle w:val="h11"/>
+        <w:rPr/>
+      </w:pPr>
+      <w:r>
+        <w:rPr/>
+        <w:t>Висновки</w:t>
+      </w:r>
+    </w:p>
+    <w:p>
+      <w:pPr>
+        <w:pStyle w:val="P1"/>
+        <w:rPr/>
+      </w:pPr>
+      <w:r>
+        <w:rPr/>
+      </w:r>
+    </w:p>
+    <w:p>
+      <w:pPr>
+        <w:pStyle w:val="P1"/>
+        <w:rPr/>
+      </w:pPr>
+      <w:r>
+        <w:rPr/>
+        <w:t>Благодаттю Господа нашого Ісуса Христа зроблено роботу.</w:t>
+      </w:r>
+    </w:p>
+    <w:p>
+      <w:pPr>
+        <w:pStyle w:val="P1"/>
+        <w:rPr/>
+      </w:pPr>
+      <w:r>
+        <w:rPr/>
+        <w:t>Багатошаровий персептрон навчається довше, але його помилка класифікації є нижчою.</w:t>
+      </w:r>
+    </w:p>
+    <w:p>
+      <w:pPr>
+        <w:pStyle w:val="P1"/>
+        <w:rPr/>
+      </w:pPr>
+      <w:r>
+        <w:rPr/>
+        <w:t>Час класифікації зазвичай значно менший за час навчання.</w:t>
+      </w:r>
+    </w:p>
+    <w:p>
+      <w:pPr>
+        <w:pStyle w:val="P1"/>
+        <w:rPr/>
+      </w:pPr>
+      <w:r>
+        <w:rPr/>
+        <w:t>Радіально-базисна мережа показує найкращий результат на навчальній вибірці, але може мати гіршу помилку на тестовій вибірці.</w:t>
+      </w:r>
+    </w:p>
+    <w:p>
+      <w:pPr>
+        <w:pStyle w:val="h11"/>
+        <w:rPr/>
+      </w:pPr>
+      <w:r>
+        <w:rPr/>
+        <w:t>Питання</w:t>
       </w:r>
     </w:p>
     <w:p>
@@ -1047,7 +2430,45 @@
       </w:pPr>
       <w:r>
         <w:rPr/>
-        <w:t>Код</w:t>
+        <w:t>3 Властивості штучних нейромереж.</w:t>
+      </w:r>
+    </w:p>
+    <w:p>
+      <w:pPr>
+        <w:pStyle w:val="P1"/>
+        <w:rPr/>
+      </w:pPr>
+      <w:r>
+        <w:rPr/>
+      </w:r>
+    </w:p>
+    <w:p>
+      <w:pPr>
+        <w:pStyle w:val="P1"/>
+        <w:rPr/>
+      </w:pPr>
+      <w:r>
+        <w:rPr/>
+        <w:t>Бувають одношарові або багатошарові. Складаються з нейронів. Нейрони складаються з дендритів (вхідних зв’язків) та аксона (вихідного зв’язку).</w:t>
+      </w:r>
+    </w:p>
+    <w:p>
+      <w:pPr>
+        <w:pStyle w:val="P1"/>
+        <w:rPr/>
+      </w:pPr>
+      <w:r>
+        <w:rPr/>
+        <w:t>Нейрони можуть навчатися, підлаштовуючи свої ваги на основі прикладів (навчання з учителем).</w:t>
+      </w:r>
+    </w:p>
+    <w:p>
+      <w:pPr>
+        <w:pStyle w:val="P1"/>
+        <w:rPr/>
+      </w:pPr>
+      <w:r>
+        <w:rPr/>
       </w:r>
     </w:p>
     <w:p>
@@ -1057,94 +2478,6 @@
       </w:pPr>
       <w:r>
         <w:rPr/>
-        <w:t>Вхідні дані та результати</w:t>
-      </w:r>
-    </w:p>
-    <w:p>
-      <w:pPr>
-        <w:pStyle w:val="H2"/>
-        <w:rPr/>
-      </w:pPr>
-      <w:r>
-        <w:rPr/>
-        <w:t>Таблиці</w:t>
-      </w:r>
-    </w:p>
-    <w:p>
-      <w:pPr>
-        <w:pStyle w:val="H2"/>
-        <w:rPr/>
-      </w:pPr>
-      <w:r>
-        <w:rPr/>
-        <w:t>Графіки</w:t>
-      </w:r>
-    </w:p>
-    <w:p>
-      <w:pPr>
-        <w:pStyle w:val="h11"/>
-        <w:rPr/>
-      </w:pPr>
-      <w:r>
-        <w:rPr/>
-        <w:t>Питання</w:t>
-      </w:r>
-    </w:p>
-    <w:p>
-      <w:pPr>
-        <w:pStyle w:val="H2"/>
-        <w:rPr/>
-      </w:pPr>
-      <w:r>
-        <w:rPr/>
-        <w:t>3 Властивості штучних нейромереж.</w:t>
-      </w:r>
-    </w:p>
-    <w:p>
-      <w:pPr>
-        <w:pStyle w:val="P1"/>
-        <w:rPr/>
-      </w:pPr>
-      <w:r>
-        <w:rPr/>
-      </w:r>
-    </w:p>
-    <w:p>
-      <w:pPr>
-        <w:pStyle w:val="P1"/>
-        <w:rPr/>
-      </w:pPr>
-      <w:r>
-        <w:rPr/>
-        <w:t>Бувають одношарові або багатошарові. Складаються з нейронів. Нейрони складаються з дендритів (вхідних зв’язків) та аксона (вихідного зв’язку).</w:t>
-      </w:r>
-    </w:p>
-    <w:p>
-      <w:pPr>
-        <w:pStyle w:val="P1"/>
-        <w:rPr/>
-      </w:pPr>
-      <w:r>
-        <w:rPr/>
-        <w:t>Нейрони можуть навчатися, підлаштовуючи свої ваги на основі прикладів (навчання з учителем).</w:t>
-      </w:r>
-    </w:p>
-    <w:p>
-      <w:pPr>
-        <w:pStyle w:val="P1"/>
-        <w:rPr/>
-      </w:pPr>
-      <w:r>
-        <w:rPr/>
-      </w:r>
-    </w:p>
-    <w:p>
-      <w:pPr>
-        <w:pStyle w:val="H2"/>
-        <w:rPr/>
-      </w:pPr>
-      <w:r>
-        <w:rPr/>
         <w:t>13 Поняття:   формальний   нейрон,   синапс,   вага   (ваговий коефіцієнт),  поріг,  дискримінантна  (вагова)  функція,  функція активації, бажаний  і  реальний  вихід  нейромережі,  навчання нейромережі, класифікація,  апроксимація,  оцінювання,  помилка навчання / класифікації, час навчання / класифікації, цільова функція навчання.</w:t>
       </w:r>
     </w:p>
@@ -1204,7 +2537,11 @@
       </w:pPr>
       <w:r>
         <w:rPr/>
-        <w:t xml:space="preserve">- дискримінантна (вагова) функція - </w:t>
+        <w:t xml:space="preserve">- дискримінантна (вагова) функція — </w:t>
+      </w:r>
+      <w:r>
+        <w:rPr/>
+        <w:t>спеціальна математична конструкція, яка використовується при підсумовуванні, інтегруванні чи усередненні, щоб надати більшої ваги певним елементам;</w:t>
       </w:r>
     </w:p>
     <w:p>
@@ -1234,7 +2571,11 @@
       </w:pPr>
       <w:r>
         <w:rPr/>
-        <w:t xml:space="preserve">- навчання нейромережі - </w:t>
+        <w:t xml:space="preserve">- навчання нейромережі — </w:t>
+      </w:r>
+      <w:r>
+        <w:rPr/>
+        <w:t>здійснюється в кілька етапів, на кожному визначається різниця між прогнозом та очікуваним результатом;</w:t>
       </w:r>
     </w:p>
     <w:p>
@@ -1264,17 +2605,25 @@
       </w:pPr>
       <w:r>
         <w:rPr/>
-        <w:t xml:space="preserve">- оцінювання - </w:t>
-      </w:r>
-    </w:p>
-    <w:p>
-      <w:pPr>
-        <w:pStyle w:val="P1"/>
-        <w:rPr/>
-      </w:pPr>
-      <w:r>
-        <w:rPr/>
-        <w:t xml:space="preserve">- помилка навчання / класифікації - </w:t>
+        <w:t xml:space="preserve">- оцінювання — </w:t>
+      </w:r>
+      <w:r>
+        <w:rPr/>
+        <w:t>процес використання вже навченої нейронної мережі для отримання результату на нових даних;</w:t>
+      </w:r>
+    </w:p>
+    <w:p>
+      <w:pPr>
+        <w:pStyle w:val="P1"/>
+        <w:rPr/>
+      </w:pPr>
+      <w:r>
+        <w:rPr/>
+        <w:t xml:space="preserve">- помилка навчання / класифікації — </w:t>
+      </w:r>
+      <w:r>
+        <w:rPr/>
+        <w:t>помилка навчання це розбіжність між реальним виходом мережі та бажаним результатом, а помилка класифікації це помилка на даних, які мережа не бачила;</w:t>
       </w:r>
     </w:p>
     <w:p>
@@ -1294,7 +2643,11 @@
       </w:pPr>
       <w:r>
         <w:rPr/>
-        <w:t xml:space="preserve">- цільова функція навчання - </w:t>
+        <w:t xml:space="preserve">- цільова функція навчання — </w:t>
+      </w:r>
+      <w:r>
+        <w:rPr/>
+        <w:t>математичне мірило того, наскільки погано працює мережа на даних момент.</w:t>
       </w:r>
     </w:p>
     <w:p>

</xml_diff>